<commit_message>
Avance Tarea 1c: XML de ejemplo y XSD con restriccion de enumeracion en estatus - Tarea 1 completa
</commit_message>
<xml_diff>
--- a/233349_ZUÑIGACHACON_SAYURIESTEFANIA.docx
+++ b/233349_ZUÑIGACHACON_SAYURIESTEFANIA.docx
@@ -170,12 +170,12 @@
             <wp:extent cx="4876800" cy="2876550"/>
             <wp:effectExtent b="0" l="0" r="0" t="0"/>
             <wp:wrapSquare wrapText="bothSides" distB="114300" distT="114300" distL="114300" distR="114300"/>
-            <wp:docPr id="1" name="image1.png"/>
+            <wp:docPr id="3" name="image3.png"/>
             <a:graphic>
               <a:graphicData uri="http://schemas.openxmlformats.org/drawingml/2006/picture">
                 <pic:pic>
                   <pic:nvPicPr>
-                    <pic:cNvPr id="0" name="image1.png"/>
+                    <pic:cNvPr id="0" name="image3.png"/>
                     <pic:cNvPicPr preferRelativeResize="0"/>
                   </pic:nvPicPr>
                   <pic:blipFill>
@@ -2432,6 +2432,221 @@
           <w:rtl w:val="0"/>
         </w:rPr>
         <w:t xml:space="preserve">Protocolo: REST sobre HTTPS</w:t>
+      </w:r>
+    </w:p>
+    <w:p>
+      <w:pPr>
+        <w:rPr/>
+      </w:pPr>
+      <w:r>
+        <w:rPr>
+          <w:rtl w:val="0"/>
+        </w:rPr>
+      </w:r>
+    </w:p>
+    <w:p>
+      <w:pPr>
+        <w:rPr/>
+      </w:pPr>
+      <w:r>
+        <w:rPr>
+          <w:rtl w:val="0"/>
+        </w:rPr>
+        <w:t xml:space="preserve">C) XML Y XSD</w:t>
+        <w:br w:type="textWrapping"/>
+        <w:br w:type="textWrapping"/>
+        <w:t xml:space="preserve">XML</w:t>
+      </w:r>
+    </w:p>
+    <w:p>
+      <w:pPr>
+        <w:rPr/>
+      </w:pPr>
+      <w:r>
+        <w:rPr>
+          <w:rtl w:val="0"/>
+        </w:rPr>
+      </w:r>
+    </w:p>
+    <w:p>
+      <w:pPr>
+        <w:rPr/>
+      </w:pPr>
+      <w:r>
+        <w:rPr/>
+        <w:drawing>
+          <wp:inline distB="114300" distT="114300" distL="114300" distR="114300">
+            <wp:extent cx="3948113" cy="2916795"/>
+            <wp:effectExtent b="0" l="0" r="0" t="0"/>
+            <wp:docPr id="1" name="image1.png"/>
+            <a:graphic>
+              <a:graphicData uri="http://schemas.openxmlformats.org/drawingml/2006/picture">
+                <pic:pic>
+                  <pic:nvPicPr>
+                    <pic:cNvPr id="0" name="image1.png"/>
+                    <pic:cNvPicPr preferRelativeResize="0"/>
+                  </pic:nvPicPr>
+                  <pic:blipFill>
+                    <a:blip r:embed="rId7"/>
+                    <a:srcRect b="0" l="0" r="0" t="0"/>
+                    <a:stretch>
+                      <a:fillRect/>
+                    </a:stretch>
+                  </pic:blipFill>
+                  <pic:spPr>
+                    <a:xfrm>
+                      <a:off x="0" y="0"/>
+                      <a:ext cx="3948113" cy="2916795"/>
+                    </a:xfrm>
+                    <a:prstGeom prst="rect"/>
+                    <a:ln/>
+                  </pic:spPr>
+                </pic:pic>
+              </a:graphicData>
+            </a:graphic>
+          </wp:inline>
+        </w:drawing>
+      </w:r>
+      <w:r>
+        <w:rPr>
+          <w:rtl w:val="0"/>
+        </w:rPr>
+      </w:r>
+    </w:p>
+    <w:p>
+      <w:pPr>
+        <w:rPr/>
+      </w:pPr>
+      <w:r>
+        <w:rPr>
+          <w:rtl w:val="0"/>
+        </w:rPr>
+      </w:r>
+    </w:p>
+    <w:p>
+      <w:pPr>
+        <w:rPr/>
+      </w:pPr>
+      <w:r>
+        <w:rPr>
+          <w:rtl w:val="0"/>
+        </w:rPr>
+      </w:r>
+    </w:p>
+    <w:p>
+      <w:pPr>
+        <w:rPr/>
+      </w:pPr>
+      <w:r>
+        <w:rPr>
+          <w:rtl w:val="0"/>
+        </w:rPr>
+      </w:r>
+    </w:p>
+    <w:p>
+      <w:pPr>
+        <w:rPr/>
+      </w:pPr>
+      <w:r>
+        <w:rPr>
+          <w:rtl w:val="0"/>
+        </w:rPr>
+      </w:r>
+    </w:p>
+    <w:p>
+      <w:pPr>
+        <w:rPr/>
+      </w:pPr>
+      <w:r>
+        <w:rPr>
+          <w:rtl w:val="0"/>
+        </w:rPr>
+      </w:r>
+    </w:p>
+    <w:p>
+      <w:pPr>
+        <w:rPr/>
+      </w:pPr>
+      <w:r>
+        <w:rPr>
+          <w:rtl w:val="0"/>
+        </w:rPr>
+      </w:r>
+    </w:p>
+    <w:p>
+      <w:pPr>
+        <w:rPr/>
+      </w:pPr>
+      <w:r>
+        <w:rPr>
+          <w:rtl w:val="0"/>
+        </w:rPr>
+      </w:r>
+    </w:p>
+    <w:p>
+      <w:pPr>
+        <w:rPr/>
+      </w:pPr>
+      <w:r>
+        <w:rPr>
+          <w:rtl w:val="0"/>
+        </w:rPr>
+        <w:t xml:space="preserve">XSD</w:t>
+      </w:r>
+    </w:p>
+    <w:p>
+      <w:pPr>
+        <w:rPr/>
+      </w:pPr>
+      <w:r>
+        <w:rPr/>
+        <w:drawing>
+          <wp:inline distB="114300" distT="114300" distL="114300" distR="114300">
+            <wp:extent cx="4720941" cy="5167313"/>
+            <wp:effectExtent b="0" l="0" r="0" t="0"/>
+            <wp:docPr id="2" name="image2.png"/>
+            <a:graphic>
+              <a:graphicData uri="http://schemas.openxmlformats.org/drawingml/2006/picture">
+                <pic:pic>
+                  <pic:nvPicPr>
+                    <pic:cNvPr id="0" name="image2.png"/>
+                    <pic:cNvPicPr preferRelativeResize="0"/>
+                  </pic:nvPicPr>
+                  <pic:blipFill>
+                    <a:blip r:embed="rId8"/>
+                    <a:srcRect b="0" l="0" r="0" t="0"/>
+                    <a:stretch>
+                      <a:fillRect/>
+                    </a:stretch>
+                  </pic:blipFill>
+                  <pic:spPr>
+                    <a:xfrm>
+                      <a:off x="0" y="0"/>
+                      <a:ext cx="4720941" cy="5167313"/>
+                    </a:xfrm>
+                    <a:prstGeom prst="rect"/>
+                    <a:ln/>
+                  </pic:spPr>
+                </pic:pic>
+              </a:graphicData>
+            </a:graphic>
+          </wp:inline>
+        </w:drawing>
+      </w:r>
+      <w:r>
+        <w:rPr>
+          <w:rtl w:val="0"/>
+        </w:rPr>
+      </w:r>
+    </w:p>
+    <w:p>
+      <w:pPr>
+        <w:rPr/>
+      </w:pPr>
+      <w:r>
+        <w:rPr>
+          <w:rtl w:val="0"/>
+        </w:rPr>
       </w:r>
     </w:p>
     <w:p>

</xml_diff>

<commit_message>
Avance Tarea 2: DTO con validaciones, comunicacion sincrona/asincrona y patron Saga - Tarea 2 completa
</commit_message>
<xml_diff>
--- a/233349_ZUÑIGACHACON_SAYURIESTEFANIA.docx
+++ b/233349_ZUÑIGACHACON_SAYURIESTEFANIA.docx
@@ -170,12 +170,12 @@
             <wp:extent cx="4876800" cy="2876550"/>
             <wp:effectExtent b="0" l="0" r="0" t="0"/>
             <wp:wrapSquare wrapText="bothSides" distB="114300" distT="114300" distL="114300" distR="114300"/>
-            <wp:docPr id="3" name="image3.png"/>
+            <wp:docPr id="3" name="image4.png"/>
             <a:graphic>
               <a:graphicData uri="http://schemas.openxmlformats.org/drawingml/2006/picture">
                 <pic:pic>
                   <pic:nvPicPr>
-                    <pic:cNvPr id="0" name="image3.png"/>
+                    <pic:cNvPr id="0" name="image4.png"/>
                     <pic:cNvPicPr preferRelativeResize="0"/>
                   </pic:nvPicPr>
                   <pic:blipFill>
@@ -2604,12 +2604,12 @@
           <wp:inline distB="114300" distT="114300" distL="114300" distR="114300">
             <wp:extent cx="4720941" cy="5167313"/>
             <wp:effectExtent b="0" l="0" r="0" t="0"/>
-            <wp:docPr id="2" name="image2.png"/>
+            <wp:docPr id="2" name="image3.png"/>
             <a:graphic>
               <a:graphicData uri="http://schemas.openxmlformats.org/drawingml/2006/picture">
                 <pic:pic>
                   <pic:nvPicPr>
-                    <pic:cNvPr id="0" name="image2.png"/>
+                    <pic:cNvPr id="0" name="image3.png"/>
                     <pic:cNvPicPr preferRelativeResize="0"/>
                   </pic:nvPicPr>
                   <pic:blipFill>
@@ -2647,6 +2647,641 @@
         <w:rPr>
           <w:rtl w:val="0"/>
         </w:rPr>
+      </w:r>
+    </w:p>
+    <w:p>
+      <w:pPr>
+        <w:rPr/>
+      </w:pPr>
+      <w:r>
+        <w:rPr>
+          <w:rtl w:val="0"/>
+        </w:rPr>
+      </w:r>
+    </w:p>
+    <w:p>
+      <w:pPr>
+        <w:rPr/>
+      </w:pPr>
+      <w:r>
+        <w:rPr>
+          <w:rtl w:val="0"/>
+        </w:rPr>
+      </w:r>
+    </w:p>
+    <w:p>
+      <w:pPr>
+        <w:rPr/>
+      </w:pPr>
+      <w:r>
+        <w:rPr>
+          <w:rtl w:val="0"/>
+        </w:rPr>
+      </w:r>
+    </w:p>
+    <w:p>
+      <w:pPr>
+        <w:rPr/>
+      </w:pPr>
+      <w:r>
+        <w:rPr>
+          <w:rtl w:val="0"/>
+        </w:rPr>
+      </w:r>
+    </w:p>
+    <w:p>
+      <w:pPr>
+        <w:rPr/>
+      </w:pPr>
+      <w:r>
+        <w:rPr>
+          <w:rtl w:val="0"/>
+        </w:rPr>
+      </w:r>
+    </w:p>
+    <w:p>
+      <w:pPr>
+        <w:rPr/>
+      </w:pPr>
+      <w:r>
+        <w:rPr>
+          <w:rtl w:val="0"/>
+        </w:rPr>
+      </w:r>
+    </w:p>
+    <w:p>
+      <w:pPr>
+        <w:rPr/>
+      </w:pPr>
+      <w:r>
+        <w:rPr>
+          <w:rtl w:val="0"/>
+        </w:rPr>
+      </w:r>
+    </w:p>
+    <w:p>
+      <w:pPr>
+        <w:rPr/>
+      </w:pPr>
+      <w:r>
+        <w:rPr>
+          <w:rtl w:val="0"/>
+        </w:rPr>
+      </w:r>
+    </w:p>
+    <w:p>
+      <w:pPr>
+        <w:rPr/>
+      </w:pPr>
+      <w:r>
+        <w:rPr>
+          <w:rtl w:val="0"/>
+        </w:rPr>
+      </w:r>
+    </w:p>
+    <w:p>
+      <w:pPr>
+        <w:rPr/>
+      </w:pPr>
+      <w:r>
+        <w:rPr>
+          <w:rtl w:val="0"/>
+        </w:rPr>
+      </w:r>
+    </w:p>
+    <w:p>
+      <w:pPr>
+        <w:rPr/>
+      </w:pPr>
+      <w:r>
+        <w:rPr>
+          <w:rtl w:val="0"/>
+        </w:rPr>
+      </w:r>
+    </w:p>
+    <w:p>
+      <w:pPr>
+        <w:rPr/>
+      </w:pPr>
+      <w:r>
+        <w:rPr>
+          <w:rtl w:val="0"/>
+        </w:rPr>
+      </w:r>
+    </w:p>
+    <w:p>
+      <w:pPr>
+        <w:rPr/>
+      </w:pPr>
+      <w:r>
+        <w:rPr>
+          <w:rtl w:val="0"/>
+        </w:rPr>
+      </w:r>
+    </w:p>
+    <w:p>
+      <w:pPr>
+        <w:rPr/>
+      </w:pPr>
+      <w:r>
+        <w:rPr>
+          <w:rtl w:val="0"/>
+        </w:rPr>
+      </w:r>
+    </w:p>
+    <w:p>
+      <w:pPr>
+        <w:rPr/>
+      </w:pPr>
+      <w:r>
+        <w:rPr>
+          <w:rtl w:val="0"/>
+        </w:rPr>
+        <w:t xml:space="preserve">Tarea 2b</w:t>
+      </w:r>
+    </w:p>
+    <w:p>
+      <w:pPr>
+        <w:rPr/>
+      </w:pPr>
+      <w:r>
+        <w:rPr>
+          <w:rtl w:val="0"/>
+        </w:rPr>
+      </w:r>
+    </w:p>
+    <w:p>
+      <w:pPr>
+        <w:rPr/>
+      </w:pPr>
+      <w:r>
+        <w:rPr>
+          <w:rtl w:val="0"/>
+        </w:rPr>
+        <w:t xml:space="preserve">a)</w:t>
+      </w:r>
+    </w:p>
+    <w:p>
+      <w:pPr>
+        <w:rPr/>
+      </w:pPr>
+      <w:r>
+        <w:rPr>
+          <w:rtl w:val="0"/>
+        </w:rPr>
+      </w:r>
+    </w:p>
+    <w:p>
+      <w:pPr>
+        <w:rPr/>
+      </w:pPr>
+      <w:r>
+        <w:rPr>
+          <w:rtl w:val="0"/>
+        </w:rPr>
+      </w:r>
+    </w:p>
+    <w:p>
+      <w:pPr>
+        <w:rPr/>
+      </w:pPr>
+      <w:r>
+        <w:rPr>
+          <w:rtl w:val="0"/>
+        </w:rPr>
+        <w:t xml:space="preserve">DTO</w:t>
+      </w:r>
+    </w:p>
+    <w:p>
+      <w:pPr>
+        <w:rPr/>
+      </w:pPr>
+      <w:r>
+        <w:rPr>
+          <w:rtl w:val="0"/>
+        </w:rPr>
+      </w:r>
+    </w:p>
+    <w:p>
+      <w:pPr>
+        <w:rPr/>
+      </w:pPr>
+      <w:r>
+        <w:rPr/>
+        <w:drawing>
+          <wp:inline distB="114300" distT="114300" distL="114300" distR="114300">
+            <wp:extent cx="5943600" cy="4381500"/>
+            <wp:effectExtent b="0" l="0" r="0" t="0"/>
+            <wp:docPr id="4" name="image2.png"/>
+            <a:graphic>
+              <a:graphicData uri="http://schemas.openxmlformats.org/drawingml/2006/picture">
+                <pic:pic>
+                  <pic:nvPicPr>
+                    <pic:cNvPr id="0" name="image2.png"/>
+                    <pic:cNvPicPr preferRelativeResize="0"/>
+                  </pic:nvPicPr>
+                  <pic:blipFill>
+                    <a:blip r:embed="rId9"/>
+                    <a:srcRect b="0" l="0" r="0" t="0"/>
+                    <a:stretch>
+                      <a:fillRect/>
+                    </a:stretch>
+                  </pic:blipFill>
+                  <pic:spPr>
+                    <a:xfrm>
+                      <a:off x="0" y="0"/>
+                      <a:ext cx="5943600" cy="4381500"/>
+                    </a:xfrm>
+                    <a:prstGeom prst="rect"/>
+                    <a:ln/>
+                  </pic:spPr>
+                </pic:pic>
+              </a:graphicData>
+            </a:graphic>
+          </wp:inline>
+        </w:drawing>
+      </w:r>
+      <w:r>
+        <w:rPr>
+          <w:rtl w:val="0"/>
+        </w:rPr>
+      </w:r>
+    </w:p>
+    <w:p>
+      <w:pPr>
+        <w:rPr/>
+      </w:pPr>
+      <w:r>
+        <w:rPr>
+          <w:rtl w:val="0"/>
+        </w:rPr>
+      </w:r>
+    </w:p>
+    <w:p>
+      <w:pPr>
+        <w:rPr/>
+      </w:pPr>
+      <w:r>
+        <w:rPr>
+          <w:rtl w:val="0"/>
+        </w:rPr>
+      </w:r>
+    </w:p>
+    <w:p>
+      <w:pPr>
+        <w:rPr/>
+      </w:pPr>
+      <w:r>
+        <w:rPr>
+          <w:rtl w:val="0"/>
+        </w:rPr>
+      </w:r>
+    </w:p>
+    <w:p>
+      <w:pPr>
+        <w:rPr/>
+      </w:pPr>
+      <w:r>
+        <w:rPr>
+          <w:rtl w:val="0"/>
+        </w:rPr>
+        <w:t xml:space="preserve">b) comunicacion asincrono y sincrono</w:t>
+      </w:r>
+    </w:p>
+    <w:p>
+      <w:pPr>
+        <w:rPr/>
+      </w:pPr>
+      <w:r>
+        <w:rPr>
+          <w:rtl w:val="0"/>
+        </w:rPr>
+      </w:r>
+    </w:p>
+    <w:p>
+      <w:pPr>
+        <w:rPr/>
+      </w:pPr>
+      <w:r>
+        <w:rPr>
+          <w:rtl w:val="0"/>
+        </w:rPr>
+        <w:t xml:space="preserve">Operacion sincrona: CobrarPedido</w:t>
+      </w:r>
+    </w:p>
+    <w:p>
+      <w:pPr>
+        <w:rPr/>
+      </w:pPr>
+      <w:r>
+        <w:rPr>
+          <w:rtl w:val="0"/>
+        </w:rPr>
+      </w:r>
+    </w:p>
+    <w:p>
+      <w:pPr>
+        <w:rPr/>
+      </w:pPr>
+      <w:r>
+        <w:rPr>
+          <w:rtl w:val="0"/>
+        </w:rPr>
+        <w:t xml:space="preserve">Patrón: comunicacion sincrona (REST, respuesta inmediata)</w:t>
+      </w:r>
+    </w:p>
+    <w:p>
+      <w:pPr>
+        <w:rPr/>
+      </w:pPr>
+      <w:r>
+        <w:rPr>
+          <w:rtl w:val="0"/>
+        </w:rPr>
+        <w:t xml:space="preserve">Justificación: el cliente necesita confirmación inmediata de que su pago fue aceptado antes de continuar, no tiene sentido dejarlo en incertidumbre sobre si su dinero se proceso correctamente. </w:t>
+      </w:r>
+    </w:p>
+    <w:p>
+      <w:pPr>
+        <w:rPr/>
+      </w:pPr>
+      <w:r>
+        <w:rPr>
+          <w:rtl w:val="0"/>
+        </w:rPr>
+      </w:r>
+    </w:p>
+    <w:p>
+      <w:pPr>
+        <w:rPr/>
+      </w:pPr>
+      <w:r>
+        <w:rPr>
+          <w:rtl w:val="0"/>
+        </w:rPr>
+        <w:t xml:space="preserve">Ventaja: el cliente obtiene una respuesta clara e inmediata sobre el estado de su pago.</w:t>
+      </w:r>
+    </w:p>
+    <w:p>
+      <w:pPr>
+        <w:rPr/>
+      </w:pPr>
+      <w:r>
+        <w:rPr>
+          <w:rtl w:val="0"/>
+        </w:rPr>
+        <w:t xml:space="preserve">Desventaja: si el servicio de pagos esta lento o caido, el cliente queda bloqueado esperando sin poder continuar.</w:t>
+        <w:br w:type="textWrapping"/>
+      </w:r>
+    </w:p>
+    <w:p>
+      <w:pPr>
+        <w:rPr/>
+      </w:pPr>
+      <w:r>
+        <w:rPr>
+          <w:rtl w:val="0"/>
+        </w:rPr>
+        <w:t xml:space="preserve">Operacion asincrona: AcumularDescuento</w:t>
+      </w:r>
+    </w:p>
+    <w:p>
+      <w:pPr>
+        <w:rPr/>
+      </w:pPr>
+      <w:r>
+        <w:rPr>
+          <w:rtl w:val="0"/>
+        </w:rPr>
+        <w:t xml:space="preserve">Patron: comunicacion asincrona (procesamiento en segundo plano, ejemplo:cola de mensajes)</w:t>
+      </w:r>
+    </w:p>
+    <w:p>
+      <w:pPr>
+        <w:rPr/>
+      </w:pPr>
+      <w:r>
+        <w:rPr>
+          <w:rtl w:val="0"/>
+        </w:rPr>
+        <w:t xml:space="preserve">Justificacion: el cliente no necesita ver el resultado de este calculo de forma inmediata, puede continuar con su compra o retirarse sin esperar a que el descuento se procese.</w:t>
+      </w:r>
+    </w:p>
+    <w:p>
+      <w:pPr>
+        <w:rPr/>
+      </w:pPr>
+      <w:r>
+        <w:rPr>
+          <w:rtl w:val="0"/>
+        </w:rPr>
+      </w:r>
+    </w:p>
+    <w:p>
+      <w:pPr>
+        <w:rPr/>
+      </w:pPr>
+      <w:r>
+        <w:rPr>
+          <w:rtl w:val="0"/>
+        </w:rPr>
+        <w:t xml:space="preserve">Ventaja: no bloquea la experiencia del cliente, mejorando la percepción de la velocidad de la app.</w:t>
+      </w:r>
+    </w:p>
+    <w:p>
+      <w:pPr>
+        <w:rPr/>
+      </w:pPr>
+      <w:r>
+        <w:rPr>
+          <w:rtl w:val="0"/>
+        </w:rPr>
+      </w:r>
+    </w:p>
+    <w:p>
+      <w:pPr>
+        <w:rPr/>
+      </w:pPr>
+      <w:r>
+        <w:rPr>
+          <w:rtl w:val="0"/>
+        </w:rPr>
+        <w:t xml:space="preserve">Desventaja: existe una ligera demora entre la compra  y que el descuento este realmente disponible para usarse.</w:t>
+      </w:r>
+    </w:p>
+    <w:p>
+      <w:pPr>
+        <w:rPr/>
+      </w:pPr>
+      <w:r>
+        <w:rPr>
+          <w:rtl w:val="0"/>
+        </w:rPr>
+      </w:r>
+    </w:p>
+    <w:p>
+      <w:pPr>
+        <w:rPr/>
+      </w:pPr>
+      <w:r>
+        <w:rPr>
+          <w:rtl w:val="0"/>
+        </w:rPr>
+        <w:t xml:space="preserve">C)Orquestacion</w:t>
+      </w:r>
+    </w:p>
+    <w:p>
+      <w:pPr>
+        <w:rPr/>
+      </w:pPr>
+      <w:r>
+        <w:rPr>
+          <w:rtl w:val="0"/>
+        </w:rPr>
+      </w:r>
+    </w:p>
+    <w:p>
+      <w:pPr>
+        <w:rPr/>
+      </w:pPr>
+      <w:r>
+        <w:rPr>
+          <w:rtl w:val="0"/>
+        </w:rPr>
+        <w:t xml:space="preserve">Flujo de la saga (3 pasos)</w:t>
+        <w:br w:type="textWrapping"/>
+        <w:t xml:space="preserve">RegistrarPedido- CobrarPedido-AcumularDescuento</w:t>
+      </w:r>
+    </w:p>
+    <w:p>
+      <w:pPr>
+        <w:rPr/>
+      </w:pPr>
+      <w:r>
+        <w:rPr>
+          <w:rtl w:val="0"/>
+        </w:rPr>
+      </w:r>
+    </w:p>
+    <w:p>
+      <w:pPr>
+        <w:rPr/>
+      </w:pPr>
+      <w:r>
+        <w:rPr>
+          <w:rtl w:val="0"/>
+        </w:rPr>
+        <w:t xml:space="preserve">Escenario: si falla el ultimo paso (AcumularDescuento)</w:t>
+      </w:r>
+    </w:p>
+    <w:p>
+      <w:pPr>
+        <w:rPr/>
+      </w:pPr>
+      <w:r>
+        <w:rPr>
+          <w:rtl w:val="0"/>
+        </w:rPr>
+      </w:r>
+    </w:p>
+    <w:p>
+      <w:pPr>
+        <w:rPr/>
+      </w:pPr>
+      <w:r>
+        <w:rPr>
+          <w:rtl w:val="0"/>
+        </w:rPr>
+        <w:t xml:space="preserve">Si AcumularDescuento falla despues de que RegistrarPedido y CobrarPedido ya se completaron exitosamente (pedido registrado y pago confirmado), la compesacion es la siguiente:</w:t>
+        <w:br w:type="textWrapping"/>
+        <w:br w:type="textWrapping"/>
+        <w:t xml:space="preserve">-No se cancela el pedido (paso 1).</w:t>
+      </w:r>
+    </w:p>
+    <w:p>
+      <w:pPr>
+        <w:rPr/>
+      </w:pPr>
+      <w:r>
+        <w:rPr>
+          <w:rtl w:val="0"/>
+        </w:rPr>
+        <w:t xml:space="preserve">-No se devuelve el dinero (paso 2)</w:t>
+      </w:r>
+    </w:p>
+    <w:p>
+      <w:pPr>
+        <w:rPr/>
+      </w:pPr>
+      <w:r>
+        <w:rPr>
+          <w:rtl w:val="0"/>
+        </w:rPr>
+        <w:t xml:space="preserve">-Se registra el error del calculo de descuento.</w:t>
+      </w:r>
+    </w:p>
+    <w:p>
+      <w:pPr>
+        <w:rPr/>
+      </w:pPr>
+      <w:r>
+        <w:rPr>
+          <w:rtl w:val="0"/>
+        </w:rPr>
+        <w:t xml:space="preserve">-Se programa un reintento posteriormente de AcumulenarDescuento, o se notifica al cliente  que su descuento no pudo aplicarse en ese momento.</w:t>
+      </w:r>
+    </w:p>
+    <w:p>
+      <w:pPr>
+        <w:rPr/>
+      </w:pPr>
+      <w:r>
+        <w:rPr>
+          <w:rtl w:val="0"/>
+        </w:rPr>
+      </w:r>
+    </w:p>
+    <w:p>
+      <w:pPr>
+        <w:rPr/>
+      </w:pPr>
+      <w:r>
+        <w:rPr>
+          <w:rtl w:val="0"/>
+        </w:rPr>
+        <w:t xml:space="preserve">Justificación: </w:t>
+      </w:r>
+    </w:p>
+    <w:p>
+      <w:pPr>
+        <w:rPr/>
+      </w:pPr>
+      <w:r>
+        <w:rPr>
+          <w:rtl w:val="0"/>
+        </w:rPr>
+      </w:r>
+    </w:p>
+    <w:p>
+      <w:pPr>
+        <w:rPr/>
+      </w:pPr>
+      <w:r>
+        <w:rPr>
+          <w:rtl w:val="0"/>
+        </w:rPr>
+        <w:t xml:space="preserve">RegistrarPedido y CobrarPedido son los pasos críticos del proceso del negocio, ya que representan la transacción principal (el cliente recibio su producto y pago por él ). AcumularDescuento es una operacion secundaria menor de impacto; deshacer una compra </w:t>
+      </w:r>
+    </w:p>
+    <w:p>
+      <w:pPr>
+        <w:rPr/>
+      </w:pPr>
+      <w:r>
+        <w:rPr>
+          <w:rtl w:val="0"/>
+        </w:rPr>
+        <w:t xml:space="preserve">Ya completada solo por que fallo el calculo de un beneficio adicional generaria mas friccion e insatisfacción en el cliente de la que resuelve. Por eso, en vez de una compensación destructiva (reversar todo el proceso), se opta por una estrategia de reintento o notificación. </w:t>
       </w:r>
     </w:p>
     <w:p>

</xml_diff>

<commit_message>
Avance Tarea 3: formula de conexiones OSIMM y nivel general por eslabon mas debil - Tarea 3 completa
</commit_message>
<xml_diff>
--- a/233349_ZUÑIGACHACON_SAYURIESTEFANIA.docx
+++ b/233349_ZUÑIGACHACON_SAYURIESTEFANIA.docx
@@ -170,12 +170,12 @@
             <wp:extent cx="4876800" cy="2876550"/>
             <wp:effectExtent b="0" l="0" r="0" t="0"/>
             <wp:wrapSquare wrapText="bothSides" distB="114300" distT="114300" distL="114300" distR="114300"/>
-            <wp:docPr id="3" name="image4.png"/>
+            <wp:docPr id="3" name="image1.png"/>
             <a:graphic>
               <a:graphicData uri="http://schemas.openxmlformats.org/drawingml/2006/picture">
                 <pic:pic>
                   <pic:nvPicPr>
-                    <pic:cNvPr id="0" name="image4.png"/>
+                    <pic:cNvPr id="0" name="image1.png"/>
                     <pic:cNvPicPr preferRelativeResize="0"/>
                   </pic:nvPicPr>
                   <pic:blipFill>
@@ -2478,12 +2478,12 @@
           <wp:inline distB="114300" distT="114300" distL="114300" distR="114300">
             <wp:extent cx="3948113" cy="2916795"/>
             <wp:effectExtent b="0" l="0" r="0" t="0"/>
-            <wp:docPr id="1" name="image1.png"/>
+            <wp:docPr id="1" name="image3.png"/>
             <a:graphic>
               <a:graphicData uri="http://schemas.openxmlformats.org/drawingml/2006/picture">
                 <pic:pic>
                   <pic:nvPicPr>
-                    <pic:cNvPr id="0" name="image1.png"/>
+                    <pic:cNvPr id="0" name="image3.png"/>
                     <pic:cNvPicPr preferRelativeResize="0"/>
                   </pic:nvPicPr>
                   <pic:blipFill>
@@ -2604,12 +2604,12 @@
           <wp:inline distB="114300" distT="114300" distL="114300" distR="114300">
             <wp:extent cx="4720941" cy="5167313"/>
             <wp:effectExtent b="0" l="0" r="0" t="0"/>
-            <wp:docPr id="2" name="image3.png"/>
+            <wp:docPr id="2" name="image4.png"/>
             <a:graphic>
               <a:graphicData uri="http://schemas.openxmlformats.org/drawingml/2006/picture">
                 <pic:pic>
                   <pic:nvPicPr>
-                    <pic:cNvPr id="0" name="image3.png"/>
+                    <pic:cNvPr id="0" name="image4.png"/>
                     <pic:cNvPicPr preferRelativeResize="0"/>
                   </pic:nvPicPr>
                   <pic:blipFill>
@@ -3294,6 +3294,487 @@
         </w:rPr>
       </w:r>
     </w:p>
+    <w:p>
+      <w:pPr>
+        <w:rPr/>
+      </w:pPr>
+      <w:r>
+        <w:rPr>
+          <w:rtl w:val="0"/>
+        </w:rPr>
+      </w:r>
+    </w:p>
+    <w:p>
+      <w:pPr>
+        <w:rPr/>
+      </w:pPr>
+      <w:r>
+        <w:rPr>
+          <w:rtl w:val="0"/>
+        </w:rPr>
+        <w:t xml:space="preserve">TAREA 3</w:t>
+      </w:r>
+    </w:p>
+    <w:p>
+      <w:pPr>
+        <w:rPr/>
+      </w:pPr>
+      <w:r>
+        <w:rPr>
+          <w:rtl w:val="0"/>
+        </w:rPr>
+      </w:r>
+    </w:p>
+    <w:p>
+      <w:pPr>
+        <w:numPr>
+          <w:ilvl w:val="0"/>
+          <w:numId w:val="1"/>
+        </w:numPr>
+        <w:ind w:left="720" w:hanging="360"/>
+        <w:rPr>
+          <w:u w:val="none"/>
+        </w:rPr>
+      </w:pPr>
+      <w:r>
+        <w:rPr>
+          <w:rtl w:val="0"/>
+        </w:rPr>
+        <w:t xml:space="preserve">Formula de conexiones</w:t>
+      </w:r>
+    </w:p>
+    <w:p>
+      <w:pPr>
+        <w:ind w:left="0" w:firstLine="0"/>
+        <w:rPr/>
+      </w:pPr>
+      <w:r>
+        <w:rPr>
+          <w:rtl w:val="0"/>
+        </w:rPr>
+        <w:t xml:space="preserve">Datos: </w:t>
+      </w:r>
+    </w:p>
+    <w:p>
+      <w:pPr>
+        <w:ind w:left="0" w:firstLine="0"/>
+        <w:rPr/>
+      </w:pPr>
+      <w:r>
+        <w:rPr>
+          <w:rtl w:val="0"/>
+        </w:rPr>
+        <w:t xml:space="preserve">N=9 sistemas , integrados punto a punto (sin ESB)</w:t>
+      </w:r>
+    </w:p>
+    <w:p>
+      <w:pPr>
+        <w:ind w:left="0" w:firstLine="0"/>
+        <w:rPr/>
+      </w:pPr>
+      <w:r>
+        <w:rPr>
+          <w:rtl w:val="0"/>
+        </w:rPr>
+        <w:t xml:space="preserve">Nivel 2 - Integrado.</w:t>
+      </w:r>
+    </w:p>
+    <w:p>
+      <w:pPr>
+        <w:ind w:left="0" w:firstLine="0"/>
+        <w:rPr/>
+      </w:pPr>
+      <w:r>
+        <w:rPr>
+          <w:rtl w:val="0"/>
+        </w:rPr>
+      </w:r>
+    </w:p>
+    <w:p>
+      <w:pPr>
+        <w:ind w:left="0" w:firstLine="0"/>
+        <w:rPr/>
+      </w:pPr>
+      <w:r>
+        <w:rPr>
+          <w:rtl w:val="0"/>
+        </w:rPr>
+        <w:t xml:space="preserve">Formula vista en clase </w:t>
+      </w:r>
+    </w:p>
+    <w:p>
+      <w:pPr>
+        <w:ind w:left="0" w:firstLine="0"/>
+        <w:rPr/>
+      </w:pPr>
+      <w:r>
+        <w:rPr>
+          <w:rtl w:val="0"/>
+        </w:rPr>
+        <w:t xml:space="preserve">Conexiones= N(N-1) /2</w:t>
+      </w:r>
+    </w:p>
+    <w:p>
+      <w:pPr>
+        <w:ind w:left="0" w:firstLine="0"/>
+        <w:rPr/>
+      </w:pPr>
+      <w:r>
+        <w:rPr>
+          <w:rtl w:val="0"/>
+        </w:rPr>
+      </w:r>
+    </w:p>
+    <w:p>
+      <w:pPr>
+        <w:ind w:left="0" w:firstLine="0"/>
+        <w:rPr/>
+      </w:pPr>
+      <w:r>
+        <w:rPr>
+          <w:rtl w:val="0"/>
+        </w:rPr>
+        <w:t xml:space="preserve">Aplicando formula:</w:t>
+      </w:r>
+    </w:p>
+    <w:p>
+      <w:pPr>
+        <w:ind w:left="0" w:firstLine="0"/>
+        <w:rPr/>
+      </w:pPr>
+      <w:r>
+        <w:rPr>
+          <w:rtl w:val="0"/>
+        </w:rPr>
+        <w:t xml:space="preserve">Conexiones = 9(9-1) /2</w:t>
+      </w:r>
+    </w:p>
+    <w:p>
+      <w:pPr>
+        <w:ind w:left="0" w:firstLine="0"/>
+        <w:rPr/>
+      </w:pPr>
+      <w:r>
+        <w:rPr>
+          <w:rtl w:val="0"/>
+        </w:rPr>
+        <w:t xml:space="preserve">Conexiones =9 (8) /2</w:t>
+      </w:r>
+    </w:p>
+    <w:p>
+      <w:pPr>
+        <w:ind w:left="0" w:firstLine="0"/>
+        <w:rPr/>
+      </w:pPr>
+      <w:r>
+        <w:rPr>
+          <w:rtl w:val="0"/>
+        </w:rPr>
+        <w:t xml:space="preserve">Conexiones = 72/2</w:t>
+      </w:r>
+    </w:p>
+    <w:p>
+      <w:pPr>
+        <w:ind w:left="0" w:firstLine="0"/>
+        <w:rPr/>
+      </w:pPr>
+      <w:r>
+        <w:rPr>
+          <w:rtl w:val="0"/>
+        </w:rPr>
+        <w:t xml:space="preserve">Conexiones = 36</w:t>
+      </w:r>
+    </w:p>
+    <w:p>
+      <w:pPr>
+        <w:ind w:left="0" w:firstLine="0"/>
+        <w:rPr/>
+      </w:pPr>
+      <w:r>
+        <w:rPr>
+          <w:rtl w:val="0"/>
+        </w:rPr>
+      </w:r>
+    </w:p>
+    <w:p>
+      <w:pPr>
+        <w:ind w:left="0" w:firstLine="0"/>
+        <w:rPr/>
+      </w:pPr>
+      <w:r>
+        <w:rPr>
+          <w:rtl w:val="0"/>
+        </w:rPr>
+        <w:t xml:space="preserve">Resultado: 36 conexiones directas entre los 9 sistemas.</w:t>
+      </w:r>
+    </w:p>
+    <w:p>
+      <w:pPr>
+        <w:ind w:left="0" w:firstLine="0"/>
+        <w:rPr/>
+      </w:pPr>
+      <w:r>
+        <w:rPr>
+          <w:rtl w:val="0"/>
+        </w:rPr>
+      </w:r>
+    </w:p>
+    <w:p>
+      <w:pPr>
+        <w:ind w:left="0" w:firstLine="0"/>
+        <w:rPr/>
+      </w:pPr>
+      <w:r>
+        <w:rPr>
+          <w:rtl w:val="0"/>
+        </w:rPr>
+        <w:t xml:space="preserve">B)nivel general</w:t>
+      </w:r>
+    </w:p>
+    <w:p>
+      <w:pPr>
+        <w:ind w:left="0" w:firstLine="0"/>
+        <w:rPr/>
+      </w:pPr>
+      <w:r>
+        <w:rPr>
+          <w:rtl w:val="0"/>
+        </w:rPr>
+      </w:r>
+    </w:p>
+    <w:p>
+      <w:pPr>
+        <w:ind w:left="0" w:firstLine="0"/>
+        <w:rPr/>
+      </w:pPr>
+      <w:r>
+        <w:rPr>
+          <w:rtl w:val="0"/>
+        </w:rPr>
+        <w:t xml:space="preserve">Valores por dimension: </w:t>
+      </w:r>
+    </w:p>
+    <w:p>
+      <w:pPr>
+        <w:ind w:left="0" w:firstLine="0"/>
+        <w:rPr/>
+      </w:pPr>
+      <w:r>
+        <w:rPr>
+          <w:rtl w:val="0"/>
+        </w:rPr>
+      </w:r>
+    </w:p>
+    <w:p>
+      <w:pPr>
+        <w:ind w:left="0" w:firstLine="0"/>
+        <w:rPr/>
+      </w:pPr>
+      <w:r>
+        <w:rPr>
+          <w:rtl w:val="0"/>
+        </w:rPr>
+        <w:t xml:space="preserve">Negocio:6</w:t>
+      </w:r>
+    </w:p>
+    <w:p>
+      <w:pPr>
+        <w:ind w:left="0" w:firstLine="0"/>
+        <w:rPr/>
+      </w:pPr>
+      <w:r>
+        <w:rPr>
+          <w:rtl w:val="0"/>
+        </w:rPr>
+        <w:t xml:space="preserve">Organizacion:2</w:t>
+      </w:r>
+    </w:p>
+    <w:p>
+      <w:pPr>
+        <w:ind w:left="0" w:firstLine="0"/>
+        <w:rPr/>
+      </w:pPr>
+      <w:r>
+        <w:rPr>
+          <w:rtl w:val="0"/>
+        </w:rPr>
+        <w:t xml:space="preserve">Metodo:2 </w:t>
+      </w:r>
+    </w:p>
+    <w:p>
+      <w:pPr>
+        <w:ind w:left="0" w:firstLine="0"/>
+        <w:rPr/>
+      </w:pPr>
+      <w:r>
+        <w:rPr>
+          <w:rtl w:val="0"/>
+        </w:rPr>
+        <w:t xml:space="preserve">Aplicacion:1</w:t>
+      </w:r>
+    </w:p>
+    <w:p>
+      <w:pPr>
+        <w:ind w:left="0" w:firstLine="0"/>
+        <w:rPr/>
+      </w:pPr>
+      <w:r>
+        <w:rPr>
+          <w:rtl w:val="0"/>
+        </w:rPr>
+        <w:t xml:space="preserve">Arquitectura: 1</w:t>
+      </w:r>
+    </w:p>
+    <w:p>
+      <w:pPr>
+        <w:ind w:left="0" w:firstLine="0"/>
+        <w:rPr/>
+      </w:pPr>
+      <w:r>
+        <w:rPr>
+          <w:rtl w:val="0"/>
+        </w:rPr>
+        <w:t xml:space="preserve">Informacion: 3</w:t>
+      </w:r>
+    </w:p>
+    <w:p>
+      <w:pPr>
+        <w:ind w:left="0" w:firstLine="0"/>
+        <w:rPr/>
+      </w:pPr>
+      <w:r>
+        <w:rPr>
+          <w:rtl w:val="0"/>
+        </w:rPr>
+        <w:t xml:space="preserve">Infraestructura: 4</w:t>
+      </w:r>
+    </w:p>
+    <w:p>
+      <w:pPr>
+        <w:ind w:left="0" w:firstLine="0"/>
+        <w:rPr/>
+      </w:pPr>
+      <w:r>
+        <w:rPr>
+          <w:rtl w:val="0"/>
+        </w:rPr>
+      </w:r>
+    </w:p>
+    <w:p>
+      <w:pPr>
+        <w:ind w:left="0" w:firstLine="0"/>
+        <w:rPr/>
+      </w:pPr>
+      <w:r>
+        <w:rPr>
+          <w:rtl w:val="0"/>
+        </w:rPr>
+        <w:t xml:space="preserve">Valor más bajo: 1, en la dimensión de Aplicación.</w:t>
+      </w:r>
+    </w:p>
+    <w:p>
+      <w:pPr>
+        <w:ind w:left="0" w:firstLine="0"/>
+        <w:rPr/>
+      </w:pPr>
+      <w:r>
+        <w:rPr>
+          <w:rtl w:val="0"/>
+        </w:rPr>
+      </w:r>
+    </w:p>
+    <w:p>
+      <w:pPr>
+        <w:ind w:left="0" w:firstLine="0"/>
+        <w:rPr/>
+      </w:pPr>
+      <w:r>
+        <w:rPr>
+          <w:rtl w:val="0"/>
+        </w:rPr>
+        <w:t xml:space="preserve">Nivel general: Nivel 1- silos</w:t>
+      </w:r>
+    </w:p>
+    <w:p>
+      <w:pPr>
+        <w:ind w:left="0" w:firstLine="0"/>
+        <w:rPr/>
+      </w:pPr>
+      <w:r>
+        <w:rPr>
+          <w:rtl w:val="0"/>
+        </w:rPr>
+      </w:r>
+    </w:p>
+    <w:p>
+      <w:pPr>
+        <w:ind w:left="0" w:firstLine="0"/>
+        <w:rPr/>
+      </w:pPr>
+      <w:r>
+        <w:rPr>
+          <w:rtl w:val="0"/>
+        </w:rPr>
+        <w:t xml:space="preserve">Justificación: Aunque otras dimensiones muestra mayor madurez (como Negocio en el nivel 6), la regla del eslabon más debil indica que el nivel general del sistema esta determinado por su punto más debil. Al estar la dimensión de Aplicación en el nivel 1, el sistema completo se considera en Nivel 1- Silos</w:t>
+      </w:r>
+    </w:p>
+    <w:p>
+      <w:pPr>
+        <w:ind w:left="0" w:firstLine="0"/>
+        <w:rPr/>
+      </w:pPr>
+      <w:r>
+        <w:rPr>
+          <w:rtl w:val="0"/>
+        </w:rPr>
+      </w:r>
+    </w:p>
+    <w:p>
+      <w:pPr>
+        <w:ind w:left="0" w:firstLine="0"/>
+        <w:rPr/>
+      </w:pPr>
+      <w:r>
+        <w:rPr>
+          <w:rtl w:val="0"/>
+        </w:rPr>
+        <w:t xml:space="preserve">Que falta para subir al siguiente nivel:</w:t>
+      </w:r>
+    </w:p>
+    <w:p>
+      <w:pPr>
+        <w:ind w:left="0" w:firstLine="0"/>
+        <w:rPr/>
+      </w:pPr>
+      <w:r>
+        <w:rPr>
+          <w:rtl w:val="0"/>
+        </w:rPr>
+        <w:t xml:space="preserve">Para subir del Nivel 1(Silos) al nivel 2 (Integrado) en la dimensión de aplicacion, se necesitaria que las aplicaciones de la cafeteria (registro de pedidos, cobro y descuentos) dejaran de operar de forma aislada y comenzaran a comunicarse automaticamente entre si, por ejemplo: que al completarse RegistrarPedido, esa informacion fluya directamente hacia CobrarPedido, permitiendo que ambas aplicaciones compartan datos de forma conectada. </w:t>
+      </w:r>
+    </w:p>
+    <w:p>
+      <w:pPr>
+        <w:ind w:left="0" w:firstLine="0"/>
+        <w:rPr/>
+      </w:pPr>
+      <w:r>
+        <w:rPr>
+          <w:rtl w:val="0"/>
+        </w:rPr>
+      </w:r>
+    </w:p>
+    <w:p>
+      <w:pPr>
+        <w:ind w:left="0" w:firstLine="0"/>
+        <w:rPr/>
+      </w:pPr>
+      <w:r>
+        <w:rPr>
+          <w:rtl w:val="0"/>
+        </w:rPr>
+      </w:r>
+    </w:p>
     <w:sectPr>
       <w:pgSz w:h="15840" w:w="12240" w:orient="portrait"/>
       <w:pgMar w:bottom="1440" w:top="1440" w:left="1440" w:right="1440" w:header="720" w:footer="720"/>
@@ -3304,7 +3785,121 @@
 </file>
 
 <file path=word/numbering.xml><?xml version="1.0" encoding="utf-8"?>
-<w:numbering xmlns:mc="http://schemas.openxmlformats.org/markup-compatibility/2006" xmlns:o="urn:schemas-microsoft-com:office:office" xmlns:r="http://schemas.openxmlformats.org/officeDocument/2006/relationships" xmlns:m="http://schemas.openxmlformats.org/officeDocument/2006/math" xmlns:v="urn:schemas-microsoft-com:vml" xmlns:wp="http://schemas.openxmlformats.org/drawingml/2006/wordprocessingDrawing" xmlns:w10="urn:schemas-microsoft-com:office:word" xmlns:w="http://schemas.openxmlformats.org/wordprocessingml/2006/main" xmlns:wne="http://schemas.microsoft.com/office/word/2006/wordml" xmlns:sl="http://schemas.openxmlformats.org/schemaLibrary/2006/main" xmlns:a="http://schemas.openxmlformats.org/drawingml/2006/main" xmlns:pic="http://schemas.openxmlformats.org/drawingml/2006/picture" xmlns:c="http://schemas.openxmlformats.org/drawingml/2006/chart" xmlns:lc="http://schemas.openxmlformats.org/drawingml/2006/lockedCanvas" xmlns:dgm="http://schemas.openxmlformats.org/drawingml/2006/diagram" xmlns:wps="http://schemas.microsoft.com/office/word/2010/wordprocessingShape" xmlns:wpg="http://schemas.microsoft.com/office/word/2010/wordprocessingGroup" xmlns:w14="http://schemas.microsoft.com/office/word/2010/wordml" xmlns:w15="http://schemas.microsoft.com/office/word/2012/wordml" xmlns:w16="http://schemas.microsoft.com/office/word/2018/wordml" xmlns:w16cex="http://schemas.microsoft.com/office/word/2018/wordml/cex" xmlns:w16cid="http://schemas.microsoft.com/office/word/2016/wordml/cid" xmlns="http://schemas.microsoft.com/office/tasks/2019/documenttasks" xmlns:cr="http://schemas.microsoft.com/office/comments/2020/reactions"/>
+<w:numbering xmlns:mc="http://schemas.openxmlformats.org/markup-compatibility/2006" xmlns:o="urn:schemas-microsoft-com:office:office" xmlns:r="http://schemas.openxmlformats.org/officeDocument/2006/relationships" xmlns:m="http://schemas.openxmlformats.org/officeDocument/2006/math" xmlns:v="urn:schemas-microsoft-com:vml" xmlns:wp="http://schemas.openxmlformats.org/drawingml/2006/wordprocessingDrawing" xmlns:w10="urn:schemas-microsoft-com:office:word" xmlns:w="http://schemas.openxmlformats.org/wordprocessingml/2006/main" xmlns:wne="http://schemas.microsoft.com/office/word/2006/wordml" xmlns:sl="http://schemas.openxmlformats.org/schemaLibrary/2006/main" xmlns:a="http://schemas.openxmlformats.org/drawingml/2006/main" xmlns:pic="http://schemas.openxmlformats.org/drawingml/2006/picture" xmlns:c="http://schemas.openxmlformats.org/drawingml/2006/chart" xmlns:lc="http://schemas.openxmlformats.org/drawingml/2006/lockedCanvas" xmlns:dgm="http://schemas.openxmlformats.org/drawingml/2006/diagram" xmlns:wps="http://schemas.microsoft.com/office/word/2010/wordprocessingShape" xmlns:wpg="http://schemas.microsoft.com/office/word/2010/wordprocessingGroup" xmlns:w14="http://schemas.microsoft.com/office/word/2010/wordml" xmlns:w15="http://schemas.microsoft.com/office/word/2012/wordml" xmlns:w16="http://schemas.microsoft.com/office/word/2018/wordml" xmlns:w16cex="http://schemas.microsoft.com/office/word/2018/wordml/cex" xmlns:w16cid="http://schemas.microsoft.com/office/word/2016/wordml/cid" xmlns="http://schemas.microsoft.com/office/tasks/2019/documenttasks" xmlns:cr="http://schemas.microsoft.com/office/comments/2020/reactions">
+  <w:abstractNum w:abstractNumId="1">
+    <w:lvl w:ilvl="0">
+      <w:start w:val="1"/>
+      <w:numFmt w:val="lowerLetter"/>
+      <w:lvlText w:val="%1)"/>
+      <w:lvlJc w:val="left"/>
+      <w:pPr>
+        <w:ind w:left="720" w:hanging="360"/>
+      </w:pPr>
+      <w:rPr>
+        <w:u w:val="none"/>
+      </w:rPr>
+    </w:lvl>
+    <w:lvl w:ilvl="1">
+      <w:start w:val="1"/>
+      <w:numFmt w:val="lowerRoman"/>
+      <w:lvlText w:val="%2)"/>
+      <w:lvlJc w:val="right"/>
+      <w:pPr>
+        <w:ind w:left="1440" w:hanging="360"/>
+      </w:pPr>
+      <w:rPr>
+        <w:u w:val="none"/>
+      </w:rPr>
+    </w:lvl>
+    <w:lvl w:ilvl="2">
+      <w:start w:val="1"/>
+      <w:numFmt w:val="decimal"/>
+      <w:lvlText w:val="%3)"/>
+      <w:lvlJc w:val="left"/>
+      <w:pPr>
+        <w:ind w:left="2160" w:hanging="360"/>
+      </w:pPr>
+      <w:rPr>
+        <w:u w:val="none"/>
+      </w:rPr>
+    </w:lvl>
+    <w:lvl w:ilvl="3">
+      <w:start w:val="1"/>
+      <w:numFmt w:val="lowerLetter"/>
+      <w:lvlText w:val="(%4)"/>
+      <w:lvlJc w:val="left"/>
+      <w:pPr>
+        <w:ind w:left="2880" w:hanging="360"/>
+      </w:pPr>
+      <w:rPr>
+        <w:u w:val="none"/>
+      </w:rPr>
+    </w:lvl>
+    <w:lvl w:ilvl="4">
+      <w:start w:val="1"/>
+      <w:numFmt w:val="lowerRoman"/>
+      <w:lvlText w:val="(%5)"/>
+      <w:lvlJc w:val="right"/>
+      <w:pPr>
+        <w:ind w:left="3600" w:hanging="360"/>
+      </w:pPr>
+      <w:rPr>
+        <w:u w:val="none"/>
+      </w:rPr>
+    </w:lvl>
+    <w:lvl w:ilvl="5">
+      <w:start w:val="1"/>
+      <w:numFmt w:val="decimal"/>
+      <w:lvlText w:val="(%6)"/>
+      <w:lvlJc w:val="left"/>
+      <w:pPr>
+        <w:ind w:left="4320" w:hanging="360"/>
+      </w:pPr>
+      <w:rPr>
+        <w:u w:val="none"/>
+      </w:rPr>
+    </w:lvl>
+    <w:lvl w:ilvl="6">
+      <w:start w:val="1"/>
+      <w:numFmt w:val="lowerLetter"/>
+      <w:lvlText w:val="%7."/>
+      <w:lvlJc w:val="left"/>
+      <w:pPr>
+        <w:ind w:left="5040" w:hanging="360"/>
+      </w:pPr>
+      <w:rPr>
+        <w:u w:val="none"/>
+      </w:rPr>
+    </w:lvl>
+    <w:lvl w:ilvl="7">
+      <w:start w:val="1"/>
+      <w:numFmt w:val="lowerRoman"/>
+      <w:lvlText w:val="%8."/>
+      <w:lvlJc w:val="right"/>
+      <w:pPr>
+        <w:ind w:left="5760" w:hanging="360"/>
+      </w:pPr>
+      <w:rPr>
+        <w:u w:val="none"/>
+      </w:rPr>
+    </w:lvl>
+    <w:lvl w:ilvl="8">
+      <w:start w:val="1"/>
+      <w:numFmt w:val="decimal"/>
+      <w:lvlText w:val="%9."/>
+      <w:lvlJc w:val="left"/>
+      <w:pPr>
+        <w:ind w:left="6480" w:hanging="360"/>
+      </w:pPr>
+      <w:rPr>
+        <w:u w:val="none"/>
+      </w:rPr>
+    </w:lvl>
+  </w:abstractNum>
+  <w:num w:numId="1">
+    <w:abstractNumId w:val="1"/>
+  </w:num>
+</w:numbering>
 </file>
 
 <file path=word/styles.xml><?xml version="1.0" encoding="utf-8"?>

</xml_diff>

<commit_message>
Avance Tarea 4a: arquitectura de renderizado SSG para catalogo publico y SSR para dashboard privado
</commit_message>
<xml_diff>
--- a/233349_ZUÑIGACHACON_SAYURIESTEFANIA.docx
+++ b/233349_ZUÑIGACHACON_SAYURIESTEFANIA.docx
@@ -2478,12 +2478,12 @@
           <wp:inline distB="114300" distT="114300" distL="114300" distR="114300">
             <wp:extent cx="3948113" cy="2916795"/>
             <wp:effectExtent b="0" l="0" r="0" t="0"/>
-            <wp:docPr id="1" name="image3.png"/>
+            <wp:docPr id="1" name="image4.png"/>
             <a:graphic>
               <a:graphicData uri="http://schemas.openxmlformats.org/drawingml/2006/picture">
                 <pic:pic>
                   <pic:nvPicPr>
-                    <pic:cNvPr id="0" name="image3.png"/>
+                    <pic:cNvPr id="0" name="image4.png"/>
                     <pic:cNvPicPr preferRelativeResize="0"/>
                   </pic:nvPicPr>
                   <pic:blipFill>
@@ -2604,12 +2604,12 @@
           <wp:inline distB="114300" distT="114300" distL="114300" distR="114300">
             <wp:extent cx="4720941" cy="5167313"/>
             <wp:effectExtent b="0" l="0" r="0" t="0"/>
-            <wp:docPr id="2" name="image4.png"/>
+            <wp:docPr id="2" name="image3.png"/>
             <a:graphic>
               <a:graphicData uri="http://schemas.openxmlformats.org/drawingml/2006/picture">
                 <pic:pic>
                   <pic:nvPicPr>
-                    <pic:cNvPr id="0" name="image4.png"/>
+                    <pic:cNvPr id="0" name="image3.png"/>
                     <pic:cNvPicPr preferRelativeResize="0"/>
                   </pic:nvPicPr>
                   <pic:blipFill>
@@ -3329,6 +3329,511 @@
       <w:pPr>
         <w:numPr>
           <w:ilvl w:val="0"/>
+          <w:numId w:val="3"/>
+        </w:numPr>
+        <w:ind w:left="720" w:hanging="360"/>
+        <w:rPr>
+          <w:u w:val="none"/>
+        </w:rPr>
+      </w:pPr>
+      <w:r>
+        <w:rPr>
+          <w:rtl w:val="0"/>
+        </w:rPr>
+        <w:t xml:space="preserve">Formula de conexiones</w:t>
+      </w:r>
+    </w:p>
+    <w:p>
+      <w:pPr>
+        <w:ind w:left="0" w:firstLine="0"/>
+        <w:rPr/>
+      </w:pPr>
+      <w:r>
+        <w:rPr>
+          <w:rtl w:val="0"/>
+        </w:rPr>
+        <w:t xml:space="preserve">Datos: </w:t>
+      </w:r>
+    </w:p>
+    <w:p>
+      <w:pPr>
+        <w:ind w:left="0" w:firstLine="0"/>
+        <w:rPr/>
+      </w:pPr>
+      <w:r>
+        <w:rPr>
+          <w:rtl w:val="0"/>
+        </w:rPr>
+        <w:t xml:space="preserve">N=9 sistemas , integrados punto a punto (sin ESB)</w:t>
+      </w:r>
+    </w:p>
+    <w:p>
+      <w:pPr>
+        <w:ind w:left="0" w:firstLine="0"/>
+        <w:rPr/>
+      </w:pPr>
+      <w:r>
+        <w:rPr>
+          <w:rtl w:val="0"/>
+        </w:rPr>
+        <w:t xml:space="preserve">Nivel 2 - Integrado.</w:t>
+      </w:r>
+    </w:p>
+    <w:p>
+      <w:pPr>
+        <w:ind w:left="0" w:firstLine="0"/>
+        <w:rPr/>
+      </w:pPr>
+      <w:r>
+        <w:rPr>
+          <w:rtl w:val="0"/>
+        </w:rPr>
+      </w:r>
+    </w:p>
+    <w:p>
+      <w:pPr>
+        <w:ind w:left="0" w:firstLine="0"/>
+        <w:rPr/>
+      </w:pPr>
+      <w:r>
+        <w:rPr>
+          <w:rtl w:val="0"/>
+        </w:rPr>
+        <w:t xml:space="preserve">Formula vista en clase </w:t>
+      </w:r>
+    </w:p>
+    <w:p>
+      <w:pPr>
+        <w:ind w:left="0" w:firstLine="0"/>
+        <w:rPr/>
+      </w:pPr>
+      <w:r>
+        <w:rPr>
+          <w:rtl w:val="0"/>
+        </w:rPr>
+        <w:t xml:space="preserve">Conexiones= N(N-1) /2</w:t>
+      </w:r>
+    </w:p>
+    <w:p>
+      <w:pPr>
+        <w:ind w:left="0" w:firstLine="0"/>
+        <w:rPr/>
+      </w:pPr>
+      <w:r>
+        <w:rPr>
+          <w:rtl w:val="0"/>
+        </w:rPr>
+      </w:r>
+    </w:p>
+    <w:p>
+      <w:pPr>
+        <w:ind w:left="0" w:firstLine="0"/>
+        <w:rPr/>
+      </w:pPr>
+      <w:r>
+        <w:rPr>
+          <w:rtl w:val="0"/>
+        </w:rPr>
+        <w:t xml:space="preserve">Aplicando formula:</w:t>
+      </w:r>
+    </w:p>
+    <w:p>
+      <w:pPr>
+        <w:ind w:left="0" w:firstLine="0"/>
+        <w:rPr/>
+      </w:pPr>
+      <w:r>
+        <w:rPr>
+          <w:rtl w:val="0"/>
+        </w:rPr>
+        <w:t xml:space="preserve">Conexiones = 9(9-1) /2</w:t>
+      </w:r>
+    </w:p>
+    <w:p>
+      <w:pPr>
+        <w:ind w:left="0" w:firstLine="0"/>
+        <w:rPr/>
+      </w:pPr>
+      <w:r>
+        <w:rPr>
+          <w:rtl w:val="0"/>
+        </w:rPr>
+        <w:t xml:space="preserve">Conexiones =9 (8) /2</w:t>
+      </w:r>
+    </w:p>
+    <w:p>
+      <w:pPr>
+        <w:ind w:left="0" w:firstLine="0"/>
+        <w:rPr/>
+      </w:pPr>
+      <w:r>
+        <w:rPr>
+          <w:rtl w:val="0"/>
+        </w:rPr>
+        <w:t xml:space="preserve">Conexiones = 72/2</w:t>
+      </w:r>
+    </w:p>
+    <w:p>
+      <w:pPr>
+        <w:ind w:left="0" w:firstLine="0"/>
+        <w:rPr/>
+      </w:pPr>
+      <w:r>
+        <w:rPr>
+          <w:rtl w:val="0"/>
+        </w:rPr>
+        <w:t xml:space="preserve">Conexiones = 36</w:t>
+      </w:r>
+    </w:p>
+    <w:p>
+      <w:pPr>
+        <w:ind w:left="0" w:firstLine="0"/>
+        <w:rPr/>
+      </w:pPr>
+      <w:r>
+        <w:rPr>
+          <w:rtl w:val="0"/>
+        </w:rPr>
+      </w:r>
+    </w:p>
+    <w:p>
+      <w:pPr>
+        <w:ind w:left="0" w:firstLine="0"/>
+        <w:rPr/>
+      </w:pPr>
+      <w:r>
+        <w:rPr>
+          <w:rtl w:val="0"/>
+        </w:rPr>
+        <w:t xml:space="preserve">Resultado: 36 conexiones directas entre los 9 sistemas.</w:t>
+      </w:r>
+    </w:p>
+    <w:p>
+      <w:pPr>
+        <w:ind w:left="0" w:firstLine="0"/>
+        <w:rPr/>
+      </w:pPr>
+      <w:r>
+        <w:rPr>
+          <w:rtl w:val="0"/>
+        </w:rPr>
+      </w:r>
+    </w:p>
+    <w:p>
+      <w:pPr>
+        <w:ind w:left="0" w:firstLine="0"/>
+        <w:rPr/>
+      </w:pPr>
+      <w:r>
+        <w:rPr>
+          <w:rtl w:val="0"/>
+        </w:rPr>
+        <w:t xml:space="preserve">B)nivel general</w:t>
+      </w:r>
+    </w:p>
+    <w:p>
+      <w:pPr>
+        <w:ind w:left="0" w:firstLine="0"/>
+        <w:rPr/>
+      </w:pPr>
+      <w:r>
+        <w:rPr>
+          <w:rtl w:val="0"/>
+        </w:rPr>
+      </w:r>
+    </w:p>
+    <w:p>
+      <w:pPr>
+        <w:ind w:left="0" w:firstLine="0"/>
+        <w:rPr/>
+      </w:pPr>
+      <w:r>
+        <w:rPr>
+          <w:rtl w:val="0"/>
+        </w:rPr>
+        <w:t xml:space="preserve">Valores por dimension: </w:t>
+      </w:r>
+    </w:p>
+    <w:p>
+      <w:pPr>
+        <w:ind w:left="0" w:firstLine="0"/>
+        <w:rPr/>
+      </w:pPr>
+      <w:r>
+        <w:rPr>
+          <w:rtl w:val="0"/>
+        </w:rPr>
+      </w:r>
+    </w:p>
+    <w:p>
+      <w:pPr>
+        <w:ind w:left="0" w:firstLine="0"/>
+        <w:rPr/>
+      </w:pPr>
+      <w:r>
+        <w:rPr>
+          <w:rtl w:val="0"/>
+        </w:rPr>
+        <w:t xml:space="preserve">Negocio:6</w:t>
+      </w:r>
+    </w:p>
+    <w:p>
+      <w:pPr>
+        <w:ind w:left="0" w:firstLine="0"/>
+        <w:rPr/>
+      </w:pPr>
+      <w:r>
+        <w:rPr>
+          <w:rtl w:val="0"/>
+        </w:rPr>
+        <w:t xml:space="preserve">Organizacion:2</w:t>
+      </w:r>
+    </w:p>
+    <w:p>
+      <w:pPr>
+        <w:ind w:left="0" w:firstLine="0"/>
+        <w:rPr/>
+      </w:pPr>
+      <w:r>
+        <w:rPr>
+          <w:rtl w:val="0"/>
+        </w:rPr>
+        <w:t xml:space="preserve">Metodo:2 </w:t>
+      </w:r>
+    </w:p>
+    <w:p>
+      <w:pPr>
+        <w:ind w:left="0" w:firstLine="0"/>
+        <w:rPr/>
+      </w:pPr>
+      <w:r>
+        <w:rPr>
+          <w:rtl w:val="0"/>
+        </w:rPr>
+        <w:t xml:space="preserve">Aplicacion:1</w:t>
+      </w:r>
+    </w:p>
+    <w:p>
+      <w:pPr>
+        <w:ind w:left="0" w:firstLine="0"/>
+        <w:rPr/>
+      </w:pPr>
+      <w:r>
+        <w:rPr>
+          <w:rtl w:val="0"/>
+        </w:rPr>
+        <w:t xml:space="preserve">Arquitectura: 1</w:t>
+      </w:r>
+    </w:p>
+    <w:p>
+      <w:pPr>
+        <w:ind w:left="0" w:firstLine="0"/>
+        <w:rPr/>
+      </w:pPr>
+      <w:r>
+        <w:rPr>
+          <w:rtl w:val="0"/>
+        </w:rPr>
+        <w:t xml:space="preserve">Informacion: 3</w:t>
+      </w:r>
+    </w:p>
+    <w:p>
+      <w:pPr>
+        <w:ind w:left="0" w:firstLine="0"/>
+        <w:rPr/>
+      </w:pPr>
+      <w:r>
+        <w:rPr>
+          <w:rtl w:val="0"/>
+        </w:rPr>
+        <w:t xml:space="preserve">Infraestructura: 4</w:t>
+      </w:r>
+    </w:p>
+    <w:p>
+      <w:pPr>
+        <w:ind w:left="0" w:firstLine="0"/>
+        <w:rPr/>
+      </w:pPr>
+      <w:r>
+        <w:rPr>
+          <w:rtl w:val="0"/>
+        </w:rPr>
+      </w:r>
+    </w:p>
+    <w:p>
+      <w:pPr>
+        <w:ind w:left="0" w:firstLine="0"/>
+        <w:rPr/>
+      </w:pPr>
+      <w:r>
+        <w:rPr>
+          <w:rtl w:val="0"/>
+        </w:rPr>
+        <w:t xml:space="preserve">Valor más bajo: 1, en la dimensión de Aplicación.</w:t>
+      </w:r>
+    </w:p>
+    <w:p>
+      <w:pPr>
+        <w:ind w:left="0" w:firstLine="0"/>
+        <w:rPr/>
+      </w:pPr>
+      <w:r>
+        <w:rPr>
+          <w:rtl w:val="0"/>
+        </w:rPr>
+      </w:r>
+    </w:p>
+    <w:p>
+      <w:pPr>
+        <w:ind w:left="0" w:firstLine="0"/>
+        <w:rPr/>
+      </w:pPr>
+      <w:r>
+        <w:rPr>
+          <w:rtl w:val="0"/>
+        </w:rPr>
+        <w:t xml:space="preserve">Nivel general: Nivel 1- silos</w:t>
+      </w:r>
+    </w:p>
+    <w:p>
+      <w:pPr>
+        <w:ind w:left="0" w:firstLine="0"/>
+        <w:rPr/>
+      </w:pPr>
+      <w:r>
+        <w:rPr>
+          <w:rtl w:val="0"/>
+        </w:rPr>
+      </w:r>
+    </w:p>
+    <w:p>
+      <w:pPr>
+        <w:ind w:left="0" w:firstLine="0"/>
+        <w:rPr/>
+      </w:pPr>
+      <w:r>
+        <w:rPr>
+          <w:rtl w:val="0"/>
+        </w:rPr>
+        <w:t xml:space="preserve">Justificación: Aunque otras dimensiones muestra mayor madurez (como Negocio en el nivel 6), la regla del eslabon más debil indica que el nivel general del sistema esta determinado por su punto más debil. Al estar la dimensión de Aplicación en el nivel 1, el sistema completo se considera en Nivel 1- Silos</w:t>
+      </w:r>
+    </w:p>
+    <w:p>
+      <w:pPr>
+        <w:ind w:left="0" w:firstLine="0"/>
+        <w:rPr/>
+      </w:pPr>
+      <w:r>
+        <w:rPr>
+          <w:rtl w:val="0"/>
+        </w:rPr>
+      </w:r>
+    </w:p>
+    <w:p>
+      <w:pPr>
+        <w:ind w:left="0" w:firstLine="0"/>
+        <w:rPr/>
+      </w:pPr>
+      <w:r>
+        <w:rPr>
+          <w:rtl w:val="0"/>
+        </w:rPr>
+        <w:t xml:space="preserve">Que falta para subir al siguiente nivel:</w:t>
+      </w:r>
+    </w:p>
+    <w:p>
+      <w:pPr>
+        <w:ind w:left="0" w:firstLine="0"/>
+        <w:rPr/>
+      </w:pPr>
+      <w:r>
+        <w:rPr>
+          <w:rtl w:val="0"/>
+        </w:rPr>
+        <w:t xml:space="preserve">Para subir del Nivel 1(Silos) al nivel 2 (Integrado) en la dimensión de aplicacion, se necesitaria que las aplicaciones de la cafeteria (registro de pedidos, cobro y descuentos) dejaran de operar de forma aislada y comenzaran a comunicarse automaticamente entre si, por ejemplo: que al completarse RegistrarPedido, esa informacion fluya directamente hacia CobrarPedido, permitiendo que ambas aplicaciones compartan datos de forma conectada. </w:t>
+      </w:r>
+    </w:p>
+    <w:p>
+      <w:pPr>
+        <w:ind w:left="0" w:firstLine="0"/>
+        <w:rPr/>
+      </w:pPr>
+      <w:r>
+        <w:rPr>
+          <w:rtl w:val="0"/>
+        </w:rPr>
+      </w:r>
+    </w:p>
+    <w:p>
+      <w:pPr>
+        <w:ind w:left="0" w:firstLine="0"/>
+        <w:rPr/>
+      </w:pPr>
+      <w:r>
+        <w:rPr>
+          <w:rtl w:val="0"/>
+        </w:rPr>
+        <w:t xml:space="preserve">TAREA 4</w:t>
+      </w:r>
+    </w:p>
+    <w:p>
+      <w:pPr>
+        <w:numPr>
+          <w:ilvl w:val="0"/>
+          <w:numId w:val="2"/>
+        </w:numPr>
+        <w:ind w:left="720" w:hanging="360"/>
+        <w:rPr>
+          <w:u w:val="none"/>
+        </w:rPr>
+      </w:pPr>
+      <w:r>
+        <w:rPr>
+          <w:rtl w:val="0"/>
+        </w:rPr>
+        <w:t xml:space="preserve">Renderizado en </w:t>
+      </w:r>
+      <w:hyperlink r:id="rId10">
+        <w:r>
+          <w:rPr>
+            <w:color w:val="1155cc"/>
+            <w:u w:val="single"/>
+            <w:rtl w:val="0"/>
+          </w:rPr>
+          <w:t xml:space="preserve">Next.js</w:t>
+        </w:r>
+      </w:hyperlink>
+      <w:r>
+        <w:rPr>
+          <w:rtl w:val="0"/>
+        </w:rPr>
+      </w:r>
+    </w:p>
+    <w:p>
+      <w:pPr>
+        <w:rPr/>
+      </w:pPr>
+      <w:r>
+        <w:rPr>
+          <w:rtl w:val="0"/>
+        </w:rPr>
+      </w:r>
+    </w:p>
+    <w:p>
+      <w:pPr>
+        <w:ind w:left="0" w:firstLine="0"/>
+        <w:rPr/>
+      </w:pPr>
+      <w:r>
+        <w:rPr>
+          <w:rtl w:val="0"/>
+        </w:rPr>
+      </w:r>
+    </w:p>
+    <w:p>
+      <w:pPr>
+        <w:numPr>
+          <w:ilvl w:val="0"/>
           <w:numId w:val="1"/>
         </w:numPr>
         <w:ind w:left="720" w:hanging="360"/>
@@ -3340,7 +3845,7 @@
         <w:rPr>
           <w:rtl w:val="0"/>
         </w:rPr>
-        <w:t xml:space="preserve">Formula de conexiones</w:t>
+        <w:t xml:space="preserve">Página publica (catalogo/menú): SSG (Static Site Generation)</w:t>
       </w:r>
     </w:p>
     <w:p>
@@ -3352,7 +3857,6 @@
         <w:rPr>
           <w:rtl w:val="0"/>
         </w:rPr>
-        <w:t xml:space="preserve">Datos: </w:t>
       </w:r>
     </w:p>
     <w:p>
@@ -3364,7 +3868,7 @@
         <w:rPr>
           <w:rtl w:val="0"/>
         </w:rPr>
-        <w:t xml:space="preserve">N=9 sistemas , integrados punto a punto (sin ESB)</w:t>
+        <w:t xml:space="preserve">-LPC: Muy bajo, ya que el HTML se genera una sola vez en el build y se sirve estatico, sin procesamiento en el servidor al momento de la visita.</w:t>
       </w:r>
     </w:p>
     <w:p>
@@ -3376,7 +3880,6 @@
         <w:rPr>
           <w:rtl w:val="0"/>
         </w:rPr>
-        <w:t xml:space="preserve">Nivel 2 - Integrado.</w:t>
       </w:r>
     </w:p>
     <w:p>
@@ -3388,6 +3891,7 @@
         <w:rPr>
           <w:rtl w:val="0"/>
         </w:rPr>
+        <w:t xml:space="preserve">-SEO: Óptimo, ya que el contenido completo está presente en el HTML desde la primera carga, facilitando su indexación por buscadores.</w:t>
       </w:r>
     </w:p>
     <w:p>
@@ -3399,7 +3903,6 @@
         <w:rPr>
           <w:rtl w:val="0"/>
         </w:rPr>
-        <w:t xml:space="preserve">Formula vista en clase </w:t>
       </w:r>
     </w:p>
     <w:p>
@@ -3411,7 +3914,7 @@
         <w:rPr>
           <w:rtl w:val="0"/>
         </w:rPr>
-        <w:t xml:space="preserve">Conexiones= N(N-1) /2</w:t>
+        <w:t xml:space="preserve">Dashboard privado: SSR (Server-Side Rendering)</w:t>
       </w:r>
     </w:p>
     <w:p>
@@ -3434,7 +3937,7 @@
         <w:rPr>
           <w:rtl w:val="0"/>
         </w:rPr>
-        <w:t xml:space="preserve">Aplicando formula:</w:t>
+        <w:t xml:space="preserve">-LPC: Moderado, mas lento que SSG porque el servidor procesa y consulta datos en cada visita, pero más rápido que CSR porque el HTML llega ya armado con contenido visible.</w:t>
       </w:r>
     </w:p>
     <w:p>
@@ -3446,7 +3949,6 @@
         <w:rPr>
           <w:rtl w:val="0"/>
         </w:rPr>
-        <w:t xml:space="preserve">Conexiones = 9(9-1) /2</w:t>
       </w:r>
     </w:p>
     <w:p>
@@ -3458,321 +3960,7 @@
         <w:rPr>
           <w:rtl w:val="0"/>
         </w:rPr>
-        <w:t xml:space="preserve">Conexiones =9 (8) /2</w:t>
-      </w:r>
-    </w:p>
-    <w:p>
-      <w:pPr>
-        <w:ind w:left="0" w:firstLine="0"/>
-        <w:rPr/>
-      </w:pPr>
-      <w:r>
-        <w:rPr>
-          <w:rtl w:val="0"/>
-        </w:rPr>
-        <w:t xml:space="preserve">Conexiones = 72/2</w:t>
-      </w:r>
-    </w:p>
-    <w:p>
-      <w:pPr>
-        <w:ind w:left="0" w:firstLine="0"/>
-        <w:rPr/>
-      </w:pPr>
-      <w:r>
-        <w:rPr>
-          <w:rtl w:val="0"/>
-        </w:rPr>
-        <w:t xml:space="preserve">Conexiones = 36</w:t>
-      </w:r>
-    </w:p>
-    <w:p>
-      <w:pPr>
-        <w:ind w:left="0" w:firstLine="0"/>
-        <w:rPr/>
-      </w:pPr>
-      <w:r>
-        <w:rPr>
-          <w:rtl w:val="0"/>
-        </w:rPr>
-      </w:r>
-    </w:p>
-    <w:p>
-      <w:pPr>
-        <w:ind w:left="0" w:firstLine="0"/>
-        <w:rPr/>
-      </w:pPr>
-      <w:r>
-        <w:rPr>
-          <w:rtl w:val="0"/>
-        </w:rPr>
-        <w:t xml:space="preserve">Resultado: 36 conexiones directas entre los 9 sistemas.</w:t>
-      </w:r>
-    </w:p>
-    <w:p>
-      <w:pPr>
-        <w:ind w:left="0" w:firstLine="0"/>
-        <w:rPr/>
-      </w:pPr>
-      <w:r>
-        <w:rPr>
-          <w:rtl w:val="0"/>
-        </w:rPr>
-      </w:r>
-    </w:p>
-    <w:p>
-      <w:pPr>
-        <w:ind w:left="0" w:firstLine="0"/>
-        <w:rPr/>
-      </w:pPr>
-      <w:r>
-        <w:rPr>
-          <w:rtl w:val="0"/>
-        </w:rPr>
-        <w:t xml:space="preserve">B)nivel general</w:t>
-      </w:r>
-    </w:p>
-    <w:p>
-      <w:pPr>
-        <w:ind w:left="0" w:firstLine="0"/>
-        <w:rPr/>
-      </w:pPr>
-      <w:r>
-        <w:rPr>
-          <w:rtl w:val="0"/>
-        </w:rPr>
-      </w:r>
-    </w:p>
-    <w:p>
-      <w:pPr>
-        <w:ind w:left="0" w:firstLine="0"/>
-        <w:rPr/>
-      </w:pPr>
-      <w:r>
-        <w:rPr>
-          <w:rtl w:val="0"/>
-        </w:rPr>
-        <w:t xml:space="preserve">Valores por dimension: </w:t>
-      </w:r>
-    </w:p>
-    <w:p>
-      <w:pPr>
-        <w:ind w:left="0" w:firstLine="0"/>
-        <w:rPr/>
-      </w:pPr>
-      <w:r>
-        <w:rPr>
-          <w:rtl w:val="0"/>
-        </w:rPr>
-      </w:r>
-    </w:p>
-    <w:p>
-      <w:pPr>
-        <w:ind w:left="0" w:firstLine="0"/>
-        <w:rPr/>
-      </w:pPr>
-      <w:r>
-        <w:rPr>
-          <w:rtl w:val="0"/>
-        </w:rPr>
-        <w:t xml:space="preserve">Negocio:6</w:t>
-      </w:r>
-    </w:p>
-    <w:p>
-      <w:pPr>
-        <w:ind w:left="0" w:firstLine="0"/>
-        <w:rPr/>
-      </w:pPr>
-      <w:r>
-        <w:rPr>
-          <w:rtl w:val="0"/>
-        </w:rPr>
-        <w:t xml:space="preserve">Organizacion:2</w:t>
-      </w:r>
-    </w:p>
-    <w:p>
-      <w:pPr>
-        <w:ind w:left="0" w:firstLine="0"/>
-        <w:rPr/>
-      </w:pPr>
-      <w:r>
-        <w:rPr>
-          <w:rtl w:val="0"/>
-        </w:rPr>
-        <w:t xml:space="preserve">Metodo:2 </w:t>
-      </w:r>
-    </w:p>
-    <w:p>
-      <w:pPr>
-        <w:ind w:left="0" w:firstLine="0"/>
-        <w:rPr/>
-      </w:pPr>
-      <w:r>
-        <w:rPr>
-          <w:rtl w:val="0"/>
-        </w:rPr>
-        <w:t xml:space="preserve">Aplicacion:1</w:t>
-      </w:r>
-    </w:p>
-    <w:p>
-      <w:pPr>
-        <w:ind w:left="0" w:firstLine="0"/>
-        <w:rPr/>
-      </w:pPr>
-      <w:r>
-        <w:rPr>
-          <w:rtl w:val="0"/>
-        </w:rPr>
-        <w:t xml:space="preserve">Arquitectura: 1</w:t>
-      </w:r>
-    </w:p>
-    <w:p>
-      <w:pPr>
-        <w:ind w:left="0" w:firstLine="0"/>
-        <w:rPr/>
-      </w:pPr>
-      <w:r>
-        <w:rPr>
-          <w:rtl w:val="0"/>
-        </w:rPr>
-        <w:t xml:space="preserve">Informacion: 3</w:t>
-      </w:r>
-    </w:p>
-    <w:p>
-      <w:pPr>
-        <w:ind w:left="0" w:firstLine="0"/>
-        <w:rPr/>
-      </w:pPr>
-      <w:r>
-        <w:rPr>
-          <w:rtl w:val="0"/>
-        </w:rPr>
-        <w:t xml:space="preserve">Infraestructura: 4</w:t>
-      </w:r>
-    </w:p>
-    <w:p>
-      <w:pPr>
-        <w:ind w:left="0" w:firstLine="0"/>
-        <w:rPr/>
-      </w:pPr>
-      <w:r>
-        <w:rPr>
-          <w:rtl w:val="0"/>
-        </w:rPr>
-      </w:r>
-    </w:p>
-    <w:p>
-      <w:pPr>
-        <w:ind w:left="0" w:firstLine="0"/>
-        <w:rPr/>
-      </w:pPr>
-      <w:r>
-        <w:rPr>
-          <w:rtl w:val="0"/>
-        </w:rPr>
-        <w:t xml:space="preserve">Valor más bajo: 1, en la dimensión de Aplicación.</w:t>
-      </w:r>
-    </w:p>
-    <w:p>
-      <w:pPr>
-        <w:ind w:left="0" w:firstLine="0"/>
-        <w:rPr/>
-      </w:pPr>
-      <w:r>
-        <w:rPr>
-          <w:rtl w:val="0"/>
-        </w:rPr>
-      </w:r>
-    </w:p>
-    <w:p>
-      <w:pPr>
-        <w:ind w:left="0" w:firstLine="0"/>
-        <w:rPr/>
-      </w:pPr>
-      <w:r>
-        <w:rPr>
-          <w:rtl w:val="0"/>
-        </w:rPr>
-        <w:t xml:space="preserve">Nivel general: Nivel 1- silos</w:t>
-      </w:r>
-    </w:p>
-    <w:p>
-      <w:pPr>
-        <w:ind w:left="0" w:firstLine="0"/>
-        <w:rPr/>
-      </w:pPr>
-      <w:r>
-        <w:rPr>
-          <w:rtl w:val="0"/>
-        </w:rPr>
-      </w:r>
-    </w:p>
-    <w:p>
-      <w:pPr>
-        <w:ind w:left="0" w:firstLine="0"/>
-        <w:rPr/>
-      </w:pPr>
-      <w:r>
-        <w:rPr>
-          <w:rtl w:val="0"/>
-        </w:rPr>
-        <w:t xml:space="preserve">Justificación: Aunque otras dimensiones muestra mayor madurez (como Negocio en el nivel 6), la regla del eslabon más debil indica que el nivel general del sistema esta determinado por su punto más debil. Al estar la dimensión de Aplicación en el nivel 1, el sistema completo se considera en Nivel 1- Silos</w:t>
-      </w:r>
-    </w:p>
-    <w:p>
-      <w:pPr>
-        <w:ind w:left="0" w:firstLine="0"/>
-        <w:rPr/>
-      </w:pPr>
-      <w:r>
-        <w:rPr>
-          <w:rtl w:val="0"/>
-        </w:rPr>
-      </w:r>
-    </w:p>
-    <w:p>
-      <w:pPr>
-        <w:ind w:left="0" w:firstLine="0"/>
-        <w:rPr/>
-      </w:pPr>
-      <w:r>
-        <w:rPr>
-          <w:rtl w:val="0"/>
-        </w:rPr>
-        <w:t xml:space="preserve">Que falta para subir al siguiente nivel:</w:t>
-      </w:r>
-    </w:p>
-    <w:p>
-      <w:pPr>
-        <w:ind w:left="0" w:firstLine="0"/>
-        <w:rPr/>
-      </w:pPr>
-      <w:r>
-        <w:rPr>
-          <w:rtl w:val="0"/>
-        </w:rPr>
-        <w:t xml:space="preserve">Para subir del Nivel 1(Silos) al nivel 2 (Integrado) en la dimensión de aplicacion, se necesitaria que las aplicaciones de la cafeteria (registro de pedidos, cobro y descuentos) dejaran de operar de forma aislada y comenzaran a comunicarse automaticamente entre si, por ejemplo: que al completarse RegistrarPedido, esa informacion fluya directamente hacia CobrarPedido, permitiendo que ambas aplicaciones compartan datos de forma conectada. </w:t>
-      </w:r>
-    </w:p>
-    <w:p>
-      <w:pPr>
-        <w:ind w:left="0" w:firstLine="0"/>
-        <w:rPr/>
-      </w:pPr>
-      <w:r>
-        <w:rPr>
-          <w:rtl w:val="0"/>
-        </w:rPr>
-      </w:r>
-    </w:p>
-    <w:p>
-      <w:pPr>
-        <w:ind w:left="0" w:firstLine="0"/>
-        <w:rPr/>
-      </w:pPr>
-      <w:r>
-        <w:rPr>
-          <w:rtl w:val="0"/>
-        </w:rPr>
+        <w:t xml:space="preserve">-SEO: No relevante, ya que es una página privada protegida por login, no indexada por buscadores.</w:t>
       </w:r>
     </w:p>
     <w:sectPr>
@@ -3789,6 +3977,226 @@
   <w:abstractNum w:abstractNumId="1">
     <w:lvl w:ilvl="0">
       <w:start w:val="1"/>
+      <w:numFmt w:val="bullet"/>
+      <w:lvlText w:val="●"/>
+      <w:lvlJc w:val="left"/>
+      <w:pPr>
+        <w:ind w:left="720" w:hanging="360"/>
+      </w:pPr>
+      <w:rPr>
+        <w:u w:val="none"/>
+      </w:rPr>
+    </w:lvl>
+    <w:lvl w:ilvl="1">
+      <w:start w:val="1"/>
+      <w:numFmt w:val="bullet"/>
+      <w:lvlText w:val="○"/>
+      <w:lvlJc w:val="left"/>
+      <w:pPr>
+        <w:ind w:left="1440" w:hanging="360"/>
+      </w:pPr>
+      <w:rPr>
+        <w:u w:val="none"/>
+      </w:rPr>
+    </w:lvl>
+    <w:lvl w:ilvl="2">
+      <w:start w:val="1"/>
+      <w:numFmt w:val="bullet"/>
+      <w:lvlText w:val="■"/>
+      <w:lvlJc w:val="left"/>
+      <w:pPr>
+        <w:ind w:left="2160" w:hanging="360"/>
+      </w:pPr>
+      <w:rPr>
+        <w:u w:val="none"/>
+      </w:rPr>
+    </w:lvl>
+    <w:lvl w:ilvl="3">
+      <w:start w:val="1"/>
+      <w:numFmt w:val="bullet"/>
+      <w:lvlText w:val="●"/>
+      <w:lvlJc w:val="left"/>
+      <w:pPr>
+        <w:ind w:left="2880" w:hanging="360"/>
+      </w:pPr>
+      <w:rPr>
+        <w:u w:val="none"/>
+      </w:rPr>
+    </w:lvl>
+    <w:lvl w:ilvl="4">
+      <w:start w:val="1"/>
+      <w:numFmt w:val="bullet"/>
+      <w:lvlText w:val="○"/>
+      <w:lvlJc w:val="left"/>
+      <w:pPr>
+        <w:ind w:left="3600" w:hanging="360"/>
+      </w:pPr>
+      <w:rPr>
+        <w:u w:val="none"/>
+      </w:rPr>
+    </w:lvl>
+    <w:lvl w:ilvl="5">
+      <w:start w:val="1"/>
+      <w:numFmt w:val="bullet"/>
+      <w:lvlText w:val="■"/>
+      <w:lvlJc w:val="left"/>
+      <w:pPr>
+        <w:ind w:left="4320" w:hanging="360"/>
+      </w:pPr>
+      <w:rPr>
+        <w:u w:val="none"/>
+      </w:rPr>
+    </w:lvl>
+    <w:lvl w:ilvl="6">
+      <w:start w:val="1"/>
+      <w:numFmt w:val="bullet"/>
+      <w:lvlText w:val="●"/>
+      <w:lvlJc w:val="left"/>
+      <w:pPr>
+        <w:ind w:left="5040" w:hanging="360"/>
+      </w:pPr>
+      <w:rPr>
+        <w:u w:val="none"/>
+      </w:rPr>
+    </w:lvl>
+    <w:lvl w:ilvl="7">
+      <w:start w:val="1"/>
+      <w:numFmt w:val="bullet"/>
+      <w:lvlText w:val="○"/>
+      <w:lvlJc w:val="left"/>
+      <w:pPr>
+        <w:ind w:left="5760" w:hanging="360"/>
+      </w:pPr>
+      <w:rPr>
+        <w:u w:val="none"/>
+      </w:rPr>
+    </w:lvl>
+    <w:lvl w:ilvl="8">
+      <w:start w:val="1"/>
+      <w:numFmt w:val="bullet"/>
+      <w:lvlText w:val="■"/>
+      <w:lvlJc w:val="left"/>
+      <w:pPr>
+        <w:ind w:left="6480" w:hanging="360"/>
+      </w:pPr>
+      <w:rPr>
+        <w:u w:val="none"/>
+      </w:rPr>
+    </w:lvl>
+  </w:abstractNum>
+  <w:abstractNum w:abstractNumId="2">
+    <w:lvl w:ilvl="0">
+      <w:start w:val="1"/>
+      <w:numFmt w:val="upperLetter"/>
+      <w:lvlText w:val="%1)"/>
+      <w:lvlJc w:val="left"/>
+      <w:pPr>
+        <w:ind w:left="720" w:hanging="360"/>
+      </w:pPr>
+      <w:rPr>
+        <w:u w:val="none"/>
+      </w:rPr>
+    </w:lvl>
+    <w:lvl w:ilvl="1">
+      <w:start w:val="1"/>
+      <w:numFmt w:val="lowerLetter"/>
+      <w:lvlText w:val="%2)"/>
+      <w:lvlJc w:val="left"/>
+      <w:pPr>
+        <w:ind w:left="1440" w:hanging="360"/>
+      </w:pPr>
+      <w:rPr>
+        <w:u w:val="none"/>
+      </w:rPr>
+    </w:lvl>
+    <w:lvl w:ilvl="2">
+      <w:start w:val="1"/>
+      <w:numFmt w:val="lowerRoman"/>
+      <w:lvlText w:val="%3)"/>
+      <w:lvlJc w:val="right"/>
+      <w:pPr>
+        <w:ind w:left="2160" w:hanging="360"/>
+      </w:pPr>
+      <w:rPr>
+        <w:u w:val="none"/>
+      </w:rPr>
+    </w:lvl>
+    <w:lvl w:ilvl="3">
+      <w:start w:val="1"/>
+      <w:numFmt w:val="decimal"/>
+      <w:lvlText w:val="(%4)"/>
+      <w:lvlJc w:val="left"/>
+      <w:pPr>
+        <w:ind w:left="2880" w:hanging="360"/>
+      </w:pPr>
+      <w:rPr>
+        <w:u w:val="none"/>
+      </w:rPr>
+    </w:lvl>
+    <w:lvl w:ilvl="4">
+      <w:start w:val="1"/>
+      <w:numFmt w:val="lowerLetter"/>
+      <w:lvlText w:val="(%5)"/>
+      <w:lvlJc w:val="left"/>
+      <w:pPr>
+        <w:ind w:left="3600" w:hanging="360"/>
+      </w:pPr>
+      <w:rPr>
+        <w:u w:val="none"/>
+      </w:rPr>
+    </w:lvl>
+    <w:lvl w:ilvl="5">
+      <w:start w:val="1"/>
+      <w:numFmt w:val="lowerRoman"/>
+      <w:lvlText w:val="(%6)"/>
+      <w:lvlJc w:val="right"/>
+      <w:pPr>
+        <w:ind w:left="4320" w:hanging="360"/>
+      </w:pPr>
+      <w:rPr>
+        <w:u w:val="none"/>
+      </w:rPr>
+    </w:lvl>
+    <w:lvl w:ilvl="6">
+      <w:start w:val="1"/>
+      <w:numFmt w:val="decimal"/>
+      <w:lvlText w:val="%7."/>
+      <w:lvlJc w:val="left"/>
+      <w:pPr>
+        <w:ind w:left="5040" w:hanging="360"/>
+      </w:pPr>
+      <w:rPr>
+        <w:u w:val="none"/>
+      </w:rPr>
+    </w:lvl>
+    <w:lvl w:ilvl="7">
+      <w:start w:val="1"/>
+      <w:numFmt w:val="lowerLetter"/>
+      <w:lvlText w:val="%8."/>
+      <w:lvlJc w:val="left"/>
+      <w:pPr>
+        <w:ind w:left="5760" w:hanging="360"/>
+      </w:pPr>
+      <w:rPr>
+        <w:u w:val="none"/>
+      </w:rPr>
+    </w:lvl>
+    <w:lvl w:ilvl="8">
+      <w:start w:val="1"/>
+      <w:numFmt w:val="lowerRoman"/>
+      <w:lvlText w:val="%9."/>
+      <w:lvlJc w:val="right"/>
+      <w:pPr>
+        <w:ind w:left="6480" w:hanging="360"/>
+      </w:pPr>
+      <w:rPr>
+        <w:u w:val="none"/>
+      </w:rPr>
+    </w:lvl>
+  </w:abstractNum>
+  <w:abstractNum w:abstractNumId="3">
+    <w:lvl w:ilvl="0">
+      <w:start w:val="1"/>
       <w:numFmt w:val="lowerLetter"/>
       <w:lvlText w:val="%1)"/>
       <w:lvlJc w:val="left"/>
@@ -3898,6 +4306,12 @@
   </w:abstractNum>
   <w:num w:numId="1">
     <w:abstractNumId w:val="1"/>
+  </w:num>
+  <w:num w:numId="2">
+    <w:abstractNumId w:val="2"/>
+  </w:num>
+  <w:num w:numId="3">
+    <w:abstractNumId w:val="3"/>
   </w:num>
 </w:numbering>
 </file>

</xml_diff>

<commit_message>
Entrega final: documento completo (Tareas 1-4, declaracion de IA, video y evidencia), diagrama editable y correcciones aplicadas
</commit_message>
<xml_diff>
--- a/233349_ZUÑIGACHACON_SAYURIESTEFANIA.docx
+++ b/233349_ZUÑIGACHACON_SAYURIESTEFANIA.docx
@@ -8,9 +8,16 @@
       </w:pPr>
       <w:r>
         <w:rPr>
-          <w:rtl w:val="0"/>
-        </w:rPr>
-        <w:t xml:space="preserve">Tarea 1 - Diseño de Servicios SOA</w:t>
+          <w:highlight w:val="yellow"/>
+          <w:rtl w:val="0"/>
+        </w:rPr>
+        <w:t xml:space="preserve">Tarea 1</w:t>
+      </w:r>
+      <w:r>
+        <w:rPr>
+          <w:rtl w:val="0"/>
+        </w:rPr>
+        <w:t xml:space="preserve"> - Diseño de Servicios SOA</w:t>
       </w:r>
     </w:p>
     <w:p>
@@ -27,11 +34,13 @@
       <w:pPr>
         <w:ind w:left="0" w:firstLine="0"/>
         <w:rPr>
+          <w:highlight w:val="cyan"/>
           <w:u w:val="none"/>
         </w:rPr>
       </w:pPr>
       <w:r>
         <w:rPr>
+          <w:highlight w:val="cyan"/>
           <w:rtl w:val="0"/>
         </w:rPr>
         <w:t xml:space="preserve">A) Modelado (Top -down)</w:t>
@@ -482,10 +491,13 @@
     </w:p>
     <w:p>
       <w:pPr>
-        <w:rPr/>
-      </w:pPr>
-      <w:r>
-        <w:rPr>
+        <w:rPr>
+          <w:highlight w:val="cyan"/>
+        </w:rPr>
+      </w:pPr>
+      <w:r>
+        <w:rPr>
+          <w:highlight w:val="cyan"/>
           <w:rtl w:val="0"/>
         </w:rPr>
         <w:t xml:space="preserve">B) Contrato de servicio</w:t>
@@ -2450,9 +2462,15 @@
       </w:pPr>
       <w:r>
         <w:rPr>
+          <w:highlight w:val="cyan"/>
           <w:rtl w:val="0"/>
         </w:rPr>
         <w:t xml:space="preserve">C) XML Y XSD</w:t>
+      </w:r>
+      <w:r>
+        <w:rPr>
+          <w:rtl w:val="0"/>
+        </w:rPr>
         <w:br w:type="textWrapping"/>
         <w:br w:type="textWrapping"/>
         <w:t xml:space="preserve">XML</w:t>
@@ -2478,12 +2496,12 @@
           <wp:inline distB="114300" distT="114300" distL="114300" distR="114300">
             <wp:extent cx="3948113" cy="2916795"/>
             <wp:effectExtent b="0" l="0" r="0" t="0"/>
-            <wp:docPr id="1" name="image4.png"/>
+            <wp:docPr id="1" name="image3.png"/>
             <a:graphic>
               <a:graphicData uri="http://schemas.openxmlformats.org/drawingml/2006/picture">
                 <pic:pic>
                   <pic:nvPicPr>
-                    <pic:cNvPr id="0" name="image4.png"/>
+                    <pic:cNvPr id="0" name="image3.png"/>
                     <pic:cNvPicPr preferRelativeResize="0"/>
                   </pic:nvPicPr>
                   <pic:blipFill>
@@ -2604,12 +2622,12 @@
           <wp:inline distB="114300" distT="114300" distL="114300" distR="114300">
             <wp:extent cx="4720941" cy="5167313"/>
             <wp:effectExtent b="0" l="0" r="0" t="0"/>
-            <wp:docPr id="2" name="image3.png"/>
+            <wp:docPr id="2" name="image2.png"/>
             <a:graphic>
               <a:graphicData uri="http://schemas.openxmlformats.org/drawingml/2006/picture">
                 <pic:pic>
                   <pic:nvPicPr>
-                    <pic:cNvPr id="0" name="image3.png"/>
+                    <pic:cNvPr id="0" name="image2.png"/>
                     <pic:cNvPicPr preferRelativeResize="0"/>
                   </pic:nvPicPr>
                   <pic:blipFill>
@@ -2791,34 +2809,40 @@
     </w:p>
     <w:p>
       <w:pPr>
-        <w:rPr/>
-      </w:pPr>
-      <w:r>
-        <w:rPr>
-          <w:rtl w:val="0"/>
-        </w:rPr>
-        <w:t xml:space="preserve">Tarea 2b</w:t>
-      </w:r>
-    </w:p>
-    <w:p>
-      <w:pPr>
-        <w:rPr/>
-      </w:pPr>
-      <w:r>
-        <w:rPr>
-          <w:rtl w:val="0"/>
-        </w:rPr>
-      </w:r>
-    </w:p>
-    <w:p>
-      <w:pPr>
-        <w:rPr/>
-      </w:pPr>
-      <w:r>
-        <w:rPr>
-          <w:rtl w:val="0"/>
-        </w:rPr>
-        <w:t xml:space="preserve">a)</w:t>
+        <w:rPr>
+          <w:highlight w:val="yellow"/>
+        </w:rPr>
+      </w:pPr>
+      <w:r>
+        <w:rPr>
+          <w:highlight w:val="yellow"/>
+          <w:rtl w:val="0"/>
+        </w:rPr>
+        <w:t xml:space="preserve">Tarea 2</w:t>
+      </w:r>
+    </w:p>
+    <w:p>
+      <w:pPr>
+        <w:rPr/>
+      </w:pPr>
+      <w:r>
+        <w:rPr>
+          <w:rtl w:val="0"/>
+        </w:rPr>
+      </w:r>
+    </w:p>
+    <w:p>
+      <w:pPr>
+        <w:rPr>
+          <w:highlight w:val="cyan"/>
+        </w:rPr>
+      </w:pPr>
+      <w:r>
+        <w:rPr>
+          <w:highlight w:val="cyan"/>
+          <w:rtl w:val="0"/>
+        </w:rPr>
+        <w:t xml:space="preserve">A)</w:t>
       </w:r>
     </w:p>
     <w:p>
@@ -2872,12 +2896,12 @@
           <wp:inline distB="114300" distT="114300" distL="114300" distR="114300">
             <wp:extent cx="5943600" cy="4381500"/>
             <wp:effectExtent b="0" l="0" r="0" t="0"/>
-            <wp:docPr id="4" name="image2.png"/>
+            <wp:docPr id="4" name="image4.png"/>
             <a:graphic>
               <a:graphicData uri="http://schemas.openxmlformats.org/drawingml/2006/picture">
                 <pic:pic>
                   <pic:nvPicPr>
-                    <pic:cNvPr id="0" name="image2.png"/>
+                    <pic:cNvPr id="0" name="image4.png"/>
                     <pic:cNvPicPr preferRelativeResize="0"/>
                   </pic:nvPicPr>
                   <pic:blipFill>
@@ -2939,10 +2963,13 @@
     </w:p>
     <w:p>
       <w:pPr>
-        <w:rPr/>
-      </w:pPr>
-      <w:r>
-        <w:rPr>
+        <w:rPr>
+          <w:highlight w:val="cyan"/>
+        </w:rPr>
+      </w:pPr>
+      <w:r>
+        <w:rPr>
+          <w:highlight w:val="cyan"/>
           <w:rtl w:val="0"/>
         </w:rPr>
         <w:t xml:space="preserve">b) comunicacion asincrono y sincrono</w:t>
@@ -3121,10 +3148,13 @@
     </w:p>
     <w:p>
       <w:pPr>
-        <w:rPr/>
-      </w:pPr>
-      <w:r>
-        <w:rPr>
+        <w:rPr>
+          <w:highlight w:val="cyan"/>
+        </w:rPr>
+      </w:pPr>
+      <w:r>
+        <w:rPr>
+          <w:highlight w:val="cyan"/>
           <w:rtl w:val="0"/>
         </w:rPr>
         <w:t xml:space="preserve">C)Orquestacion</w:t>
@@ -3192,7 +3222,7 @@
         <w:rPr>
           <w:rtl w:val="0"/>
         </w:rPr>
-        <w:t xml:space="preserve">Si AcumularDescuento falla despues de que RegistrarPedido y CobrarPedido ya se completaron exitosamente (pedido registrado y pago confirmado), la compesacion es la siguiente:</w:t>
+        <w:t xml:space="preserve">Si AcumularDescuento falla despues de que RegistrarPedido y CobrarPedido ya se completaron exitosamente (pedido registrado y pago confirmado), la compensación es la siguiente:</w:t>
         <w:br w:type="textWrapping"/>
         <w:br w:type="textWrapping"/>
         <w:t xml:space="preserve">-No se cancela el pedido (paso 1).</w:t>
@@ -3217,18 +3247,18 @@
         <w:rPr>
           <w:rtl w:val="0"/>
         </w:rPr>
-        <w:t xml:space="preserve">-Se registra el error del calculo de descuento.</w:t>
-      </w:r>
-    </w:p>
-    <w:p>
-      <w:pPr>
-        <w:rPr/>
-      </w:pPr>
-      <w:r>
-        <w:rPr>
-          <w:rtl w:val="0"/>
-        </w:rPr>
-        <w:t xml:space="preserve">-Se programa un reintento posteriormente de AcumulenarDescuento, o se notifica al cliente  que su descuento no pudo aplicarse en ese momento.</w:t>
+        <w:t xml:space="preserve">-Se registra el error del cálculo de descuento.</w:t>
+      </w:r>
+    </w:p>
+    <w:p>
+      <w:pPr>
+        <w:rPr/>
+      </w:pPr>
+      <w:r>
+        <w:rPr>
+          <w:rtl w:val="0"/>
+        </w:rPr>
+        <w:t xml:space="preserve">-Se programa un reintento posteriormente de AcumularDescuento, o se notifica al cliente  que su descuento no pudo aplicarse en ese momento.</w:t>
       </w:r>
     </w:p>
     <w:p>
@@ -3270,7 +3300,7 @@
         <w:rPr>
           <w:rtl w:val="0"/>
         </w:rPr>
-        <w:t xml:space="preserve">RegistrarPedido y CobrarPedido son los pasos críticos del proceso del negocio, ya que representan la transacción principal (el cliente recibio su producto y pago por él ). AcumularDescuento es una operacion secundaria menor de impacto; deshacer una compra </w:t>
+        <w:t xml:space="preserve">RegistrarPedido y CobrarPedido son los pasos críticos del proceso del negocio, ya que representan la transacción principal (el cliente recibio su producto y pagó por él ). AcumularDescuento es una operacion secundaria menor de impacto; deshacer una compra </w:t>
       </w:r>
     </w:p>
     <w:p>
@@ -3306,10 +3336,13 @@
     </w:p>
     <w:p>
       <w:pPr>
-        <w:rPr/>
-      </w:pPr>
-      <w:r>
-        <w:rPr>
+        <w:rPr>
+          <w:highlight w:val="yellow"/>
+        </w:rPr>
+      </w:pPr>
+      <w:r>
+        <w:rPr>
+          <w:highlight w:val="yellow"/>
           <w:rtl w:val="0"/>
         </w:rPr>
         <w:t xml:space="preserve">TAREA 3</w:t>
@@ -3317,7 +3350,9 @@
     </w:p>
     <w:p>
       <w:pPr>
-        <w:rPr/>
+        <w:rPr>
+          <w:highlight w:val="cyan"/>
+        </w:rPr>
       </w:pPr>
       <w:r>
         <w:rPr>
@@ -3329,18 +3364,19 @@
       <w:pPr>
         <w:numPr>
           <w:ilvl w:val="0"/>
-          <w:numId w:val="3"/>
+          <w:numId w:val="4"/>
         </w:numPr>
         <w:ind w:left="720" w:hanging="360"/>
         <w:rPr>
-          <w:u w:val="none"/>
-        </w:rPr>
-      </w:pPr>
-      <w:r>
-        <w:rPr>
-          <w:rtl w:val="0"/>
-        </w:rPr>
-        <w:t xml:space="preserve">Formula de conexiones</w:t>
+          <w:highlight w:val="cyan"/>
+        </w:rPr>
+      </w:pPr>
+      <w:r>
+        <w:rPr>
+          <w:highlight w:val="cyan"/>
+          <w:rtl w:val="0"/>
+        </w:rPr>
+        <w:t xml:space="preserve">Fórmula de conexiones</w:t>
       </w:r>
     </w:p>
     <w:p>
@@ -3399,7 +3435,7 @@
         <w:rPr>
           <w:rtl w:val="0"/>
         </w:rPr>
-        <w:t xml:space="preserve">Formula vista en clase </w:t>
+        <w:t xml:space="preserve">Fórmula vista en clase </w:t>
       </w:r>
     </w:p>
     <w:p>
@@ -3522,13 +3558,16 @@
     <w:p>
       <w:pPr>
         <w:ind w:left="0" w:firstLine="0"/>
-        <w:rPr/>
-      </w:pPr>
-      <w:r>
-        <w:rPr>
-          <w:rtl w:val="0"/>
-        </w:rPr>
-        <w:t xml:space="preserve">B)nivel general</w:t>
+        <w:rPr>
+          <w:highlight w:val="cyan"/>
+        </w:rPr>
+      </w:pPr>
+      <w:r>
+        <w:rPr>
+          <w:highlight w:val="cyan"/>
+          <w:rtl w:val="0"/>
+        </w:rPr>
+        <w:t xml:space="preserve">B) nivel general</w:t>
       </w:r>
     </w:p>
     <w:p>
@@ -3622,7 +3661,7 @@
         <w:rPr>
           <w:rtl w:val="0"/>
         </w:rPr>
-        <w:t xml:space="preserve">Arquitectura: 1</w:t>
+        <w:t xml:space="preserve">Arquitectura: 5</w:t>
       </w:r>
     </w:p>
     <w:p>
@@ -3715,7 +3754,7 @@
         <w:rPr>
           <w:rtl w:val="0"/>
         </w:rPr>
-        <w:t xml:space="preserve">Justificación: Aunque otras dimensiones muestra mayor madurez (como Negocio en el nivel 6), la regla del eslabon más debil indica que el nivel general del sistema esta determinado por su punto más debil. Al estar la dimensión de Aplicación en el nivel 1, el sistema completo se considera en Nivel 1- Silos</w:t>
+        <w:t xml:space="preserve">Justificación: Aunque otras dimensiones muestra mayor madurez (como Negocio en el nivel 6), la regla del eslabon más débil indica que el nivel general del sistema está determinado por su punto más débil. Al estar la dimensión de Aplicación en el nivel 1, el sistema completo se considera en Nivel 1- Silos</w:t>
       </w:r>
     </w:p>
     <w:p>
@@ -3773,7 +3812,45 @@
         <w:rPr>
           <w:rtl w:val="0"/>
         </w:rPr>
+      </w:r>
+    </w:p>
+    <w:p>
+      <w:pPr>
+        <w:ind w:left="0" w:firstLine="0"/>
+        <w:rPr>
+          <w:highlight w:val="yellow"/>
+        </w:rPr>
+      </w:pPr>
+      <w:r>
+        <w:rPr>
+          <w:highlight w:val="yellow"/>
+          <w:rtl w:val="0"/>
+        </w:rPr>
         <w:t xml:space="preserve">TAREA 4</w:t>
+      </w:r>
+    </w:p>
+    <w:p>
+      <w:pPr>
+        <w:ind w:left="0" w:firstLine="0"/>
+        <w:rPr/>
+      </w:pPr>
+      <w:r>
+        <w:rPr>
+          <w:rtl w:val="0"/>
+        </w:rPr>
+      </w:r>
+    </w:p>
+    <w:p>
+      <w:pPr>
+        <w:ind w:left="0" w:firstLine="0"/>
+        <w:rPr>
+          <w:highlight w:val="cyan"/>
+        </w:rPr>
+      </w:pPr>
+      <w:r>
+        <w:rPr>
+          <w:rtl w:val="0"/>
+        </w:rPr>
       </w:r>
     </w:p>
     <w:p>
@@ -3784,6 +3861,62 @@
         </w:numPr>
         <w:ind w:left="720" w:hanging="360"/>
         <w:rPr>
+          <w:highlight w:val="cyan"/>
+        </w:rPr>
+      </w:pPr>
+      <w:r>
+        <w:rPr>
+          <w:highlight w:val="cyan"/>
+          <w:rtl w:val="0"/>
+        </w:rPr>
+        <w:t xml:space="preserve">Renderizado en </w:t>
+      </w:r>
+      <w:hyperlink r:id="rId10">
+        <w:r>
+          <w:rPr>
+            <w:color w:val="1155cc"/>
+            <w:highlight w:val="cyan"/>
+            <w:u w:val="single"/>
+            <w:rtl w:val="0"/>
+          </w:rPr>
+          <w:t xml:space="preserve">Next.js</w:t>
+        </w:r>
+      </w:hyperlink>
+      <w:r>
+        <w:rPr>
+          <w:rtl w:val="0"/>
+        </w:rPr>
+      </w:r>
+    </w:p>
+    <w:p>
+      <w:pPr>
+        <w:rPr/>
+      </w:pPr>
+      <w:r>
+        <w:rPr>
+          <w:rtl w:val="0"/>
+        </w:rPr>
+      </w:r>
+    </w:p>
+    <w:p>
+      <w:pPr>
+        <w:ind w:left="0" w:firstLine="0"/>
+        <w:rPr/>
+      </w:pPr>
+      <w:r>
+        <w:rPr>
+          <w:rtl w:val="0"/>
+        </w:rPr>
+      </w:r>
+    </w:p>
+    <w:p>
+      <w:pPr>
+        <w:numPr>
+          <w:ilvl w:val="0"/>
+          <w:numId w:val="1"/>
+        </w:numPr>
+        <w:ind w:left="720" w:hanging="360"/>
+        <w:rPr>
           <w:u w:val="none"/>
         </w:rPr>
       </w:pPr>
@@ -3791,9 +3924,361 @@
         <w:rPr>
           <w:rtl w:val="0"/>
         </w:rPr>
-        <w:t xml:space="preserve">Renderizado en </w:t>
-      </w:r>
-      <w:hyperlink r:id="rId10">
+        <w:t xml:space="preserve">Página publica (catalogo/menú): SSG (Static Site Generation)</w:t>
+      </w:r>
+    </w:p>
+    <w:p>
+      <w:pPr>
+        <w:ind w:left="0" w:firstLine="0"/>
+        <w:rPr/>
+      </w:pPr>
+      <w:r>
+        <w:rPr>
+          <w:rtl w:val="0"/>
+        </w:rPr>
+      </w:r>
+    </w:p>
+    <w:p>
+      <w:pPr>
+        <w:ind w:left="0" w:firstLine="0"/>
+        <w:rPr/>
+      </w:pPr>
+      <w:r>
+        <w:rPr>
+          <w:rtl w:val="0"/>
+        </w:rPr>
+        <w:t xml:space="preserve">-LCP: Muy bajo, ya que el HTML se genera una sola vez en el build y se sirve estático, sin procesamiento en el servidor al momento de la visita.</w:t>
+      </w:r>
+    </w:p>
+    <w:p>
+      <w:pPr>
+        <w:ind w:left="0" w:firstLine="0"/>
+        <w:rPr/>
+      </w:pPr>
+      <w:r>
+        <w:rPr>
+          <w:rtl w:val="0"/>
+        </w:rPr>
+      </w:r>
+    </w:p>
+    <w:p>
+      <w:pPr>
+        <w:ind w:left="0" w:firstLine="0"/>
+        <w:rPr/>
+      </w:pPr>
+      <w:r>
+        <w:rPr>
+          <w:rtl w:val="0"/>
+        </w:rPr>
+        <w:t xml:space="preserve">-SEO: Óptimo, ya que el contenido completo está presente en el HTML desde la primera carga, facilitando su indexación por buscadores.</w:t>
+      </w:r>
+    </w:p>
+    <w:p>
+      <w:pPr>
+        <w:ind w:left="0" w:firstLine="0"/>
+        <w:rPr/>
+      </w:pPr>
+      <w:r>
+        <w:rPr>
+          <w:rtl w:val="0"/>
+        </w:rPr>
+      </w:r>
+    </w:p>
+    <w:p>
+      <w:pPr>
+        <w:ind w:left="0" w:firstLine="0"/>
+        <w:rPr/>
+      </w:pPr>
+      <w:r>
+        <w:rPr>
+          <w:rtl w:val="0"/>
+        </w:rPr>
+        <w:t xml:space="preserve">Dashboard privado: SSR (Server-Side Rendering)</w:t>
+      </w:r>
+    </w:p>
+    <w:p>
+      <w:pPr>
+        <w:ind w:left="0" w:firstLine="0"/>
+        <w:rPr/>
+      </w:pPr>
+      <w:r>
+        <w:rPr>
+          <w:rtl w:val="0"/>
+        </w:rPr>
+      </w:r>
+    </w:p>
+    <w:p>
+      <w:pPr>
+        <w:ind w:left="0" w:firstLine="0"/>
+        <w:rPr/>
+      </w:pPr>
+      <w:r>
+        <w:rPr>
+          <w:rtl w:val="0"/>
+        </w:rPr>
+        <w:t xml:space="preserve">-LCP: Moderado, mas lento que SSG porque el servidor procesa y consulta datos en cada visita, pero más rápido que CSR porque el HTML llega ya armado con contenido visible.</w:t>
+      </w:r>
+    </w:p>
+    <w:p>
+      <w:pPr>
+        <w:ind w:left="0" w:firstLine="0"/>
+        <w:rPr/>
+      </w:pPr>
+      <w:r>
+        <w:rPr>
+          <w:rtl w:val="0"/>
+        </w:rPr>
+      </w:r>
+    </w:p>
+    <w:p>
+      <w:pPr>
+        <w:ind w:left="0" w:firstLine="0"/>
+        <w:rPr/>
+      </w:pPr>
+      <w:r>
+        <w:rPr>
+          <w:rtl w:val="0"/>
+        </w:rPr>
+        <w:t xml:space="preserve">-SEO: No relevante, ya que es una página privada protegida por login, no indexada por buscadores.</w:t>
+      </w:r>
+    </w:p>
+    <w:p>
+      <w:pPr>
+        <w:ind w:left="0" w:firstLine="0"/>
+        <w:rPr/>
+      </w:pPr>
+      <w:r>
+        <w:rPr>
+          <w:rtl w:val="0"/>
+        </w:rPr>
+      </w:r>
+    </w:p>
+    <w:p>
+      <w:pPr>
+        <w:ind w:left="0" w:firstLine="0"/>
+        <w:rPr/>
+      </w:pPr>
+      <w:r>
+        <w:rPr>
+          <w:rtl w:val="0"/>
+        </w:rPr>
+      </w:r>
+    </w:p>
+    <w:p>
+      <w:pPr>
+        <w:numPr>
+          <w:ilvl w:val="0"/>
+          <w:numId w:val="2"/>
+        </w:numPr>
+        <w:ind w:left="720" w:hanging="360"/>
+        <w:rPr>
+          <w:highlight w:val="cyan"/>
+        </w:rPr>
+      </w:pPr>
+      <w:r>
+        <w:rPr>
+          <w:highlight w:val="cyan"/>
+          <w:rtl w:val="0"/>
+        </w:rPr>
+        <w:t xml:space="preserve">Modelo de tenancy</w:t>
+      </w:r>
+    </w:p>
+    <w:p>
+      <w:pPr>
+        <w:rPr/>
+      </w:pPr>
+      <w:r>
+        <w:rPr>
+          <w:rtl w:val="0"/>
+        </w:rPr>
+      </w:r>
+    </w:p>
+    <w:p>
+      <w:pPr>
+        <w:rPr/>
+      </w:pPr>
+      <w:r>
+        <w:rPr>
+          <w:rtl w:val="0"/>
+        </w:rPr>
+        <w:t xml:space="preserve">Modelo elegido: Pool</w:t>
+      </w:r>
+    </w:p>
+    <w:p>
+      <w:pPr>
+        <w:rPr/>
+      </w:pPr>
+      <w:r>
+        <w:rPr>
+          <w:rtl w:val="0"/>
+        </w:rPr>
+      </w:r>
+    </w:p>
+    <w:p>
+      <w:pPr>
+        <w:rPr/>
+      </w:pPr>
+      <w:r>
+        <w:rPr>
+          <w:rtl w:val="0"/>
+        </w:rPr>
+        <w:t xml:space="preserve">Justificación: Con un presupuesto de infraestructura limitado y la necesidad de atender a cientos de negocios similares, el modelo pool es el más económico, ya que todos los negocios comparten la misma infraestructura (mismo servidor, misma base de datos), evitando el costo de mantener recursos separados para cada cliente.</w:t>
+      </w:r>
+    </w:p>
+    <w:p>
+      <w:pPr>
+        <w:rPr/>
+      </w:pPr>
+      <w:r>
+        <w:rPr>
+          <w:rtl w:val="0"/>
+        </w:rPr>
+      </w:r>
+    </w:p>
+    <w:p>
+      <w:pPr>
+        <w:rPr/>
+      </w:pPr>
+      <w:r>
+        <w:rPr>
+          <w:rtl w:val="0"/>
+        </w:rPr>
+        <w:t xml:space="preserve">Riesgos a mitigar desde el diseño:</w:t>
+      </w:r>
+    </w:p>
+    <w:p>
+      <w:pPr>
+        <w:rPr/>
+      </w:pPr>
+      <w:r>
+        <w:rPr>
+          <w:rtl w:val="0"/>
+        </w:rPr>
+      </w:r>
+    </w:p>
+    <w:p>
+      <w:pPr>
+        <w:rPr/>
+      </w:pPr>
+      <w:r>
+        <w:rPr>
+          <w:rtl w:val="0"/>
+        </w:rPr>
+        <w:t xml:space="preserve">1.Fuga de datos entre tenants: Al compartir la misma base de datos, existe el riesgo de que, por un error, de filtrado en las consultas, un negocio pueda acceder accidentalmente a informacion de otro negocio (ej. Pedidos, ventas). Debe mitigarse asegurando que cada consulta filtre estrictamente por el identificador del negocio (tenant).</w:t>
+      </w:r>
+    </w:p>
+    <w:p>
+      <w:pPr>
+        <w:rPr/>
+      </w:pPr>
+      <w:r>
+        <w:rPr>
+          <w:rtl w:val="0"/>
+        </w:rPr>
+      </w:r>
+    </w:p>
+    <w:p>
+      <w:pPr>
+        <w:rPr/>
+      </w:pPr>
+      <w:r>
+        <w:rPr>
+          <w:rtl w:val="0"/>
+        </w:rPr>
+        <w:t xml:space="preserve">2.Punto unico de falla: si la infraestructura compartida falla o se cae, todos los negocios se ven afectados simultáneamente, a diferencia del modelo Silo, donde un fallo afecta solo a un cliente.</w:t>
+      </w:r>
+    </w:p>
+    <w:p>
+      <w:pPr>
+        <w:rPr/>
+      </w:pPr>
+      <w:r>
+        <w:rPr>
+          <w:rtl w:val="0"/>
+        </w:rPr>
+      </w:r>
+    </w:p>
+    <w:p>
+      <w:pPr>
+        <w:rPr/>
+      </w:pPr>
+      <w:r>
+        <w:rPr>
+          <w:rtl w:val="0"/>
+        </w:rPr>
+      </w:r>
+    </w:p>
+    <w:p>
+      <w:pPr>
+        <w:rPr/>
+      </w:pPr>
+      <w:r>
+        <w:rPr>
+          <w:rtl w:val="0"/>
+        </w:rPr>
+      </w:r>
+    </w:p>
+    <w:p>
+      <w:pPr>
+        <w:rPr/>
+      </w:pPr>
+      <w:r>
+        <w:rPr>
+          <w:rtl w:val="0"/>
+        </w:rPr>
+        <w:t xml:space="preserve">DECLARACION DE IA</w:t>
+      </w:r>
+    </w:p>
+    <w:p>
+      <w:pPr>
+        <w:rPr/>
+      </w:pPr>
+      <w:r>
+        <w:rPr>
+          <w:rtl w:val="0"/>
+        </w:rPr>
+      </w:r>
+    </w:p>
+    <w:p>
+      <w:pPr>
+        <w:spacing w:after="240" w:before="240" w:lineRule="auto"/>
+        <w:rPr/>
+      </w:pPr>
+      <w:r>
+        <w:rPr>
+          <w:rtl w:val="0"/>
+        </w:rPr>
+        <w:t xml:space="preserve">Sí utilicé una herramienta de inteligencia artificial (Claude) como apoyo durante el desarrollo de esta actividad, principalmente para comprender y reforzar conceptos relacionados con los temas vistos en clase.</w:t>
+      </w:r>
+    </w:p>
+    <w:p>
+      <w:pPr>
+        <w:spacing w:after="240" w:before="240" w:lineRule="auto"/>
+        <w:rPr/>
+      </w:pPr>
+      <w:r>
+        <w:rPr>
+          <w:rtl w:val="0"/>
+        </w:rPr>
+        <w:t xml:space="preserve">La herramienta me ayudó a:</w:t>
+      </w:r>
+    </w:p>
+    <w:p>
+      <w:pPr>
+        <w:numPr>
+          <w:ilvl w:val="0"/>
+          <w:numId w:val="3"/>
+        </w:numPr>
+        <w:spacing w:after="0" w:afterAutospacing="0" w:before="240" w:lineRule="auto"/>
+        <w:ind w:left="720" w:hanging="360"/>
+      </w:pPr>
+      <w:r>
+        <w:rPr>
+          <w:rtl w:val="0"/>
+        </w:rPr>
+        <w:t xml:space="preserve">Comprender conceptos técnicos necesarios para resolver las tareas, como DTO, contrato de servicio, Saga, OSIMM, tenancy y estrategias de renderizado en </w:t>
+      </w:r>
+      <w:hyperlink r:id="rId11">
         <w:r>
           <w:rPr>
             <w:color w:val="1155cc"/>
@@ -3807,49 +4292,104 @@
         <w:rPr>
           <w:rtl w:val="0"/>
         </w:rPr>
-      </w:r>
-    </w:p>
-    <w:p>
-      <w:pPr>
-        <w:rPr/>
-      </w:pPr>
-      <w:r>
-        <w:rPr>
-          <w:rtl w:val="0"/>
-        </w:rPr>
-      </w:r>
-    </w:p>
-    <w:p>
-      <w:pPr>
-        <w:ind w:left="0" w:firstLine="0"/>
-        <w:rPr/>
-      </w:pPr>
-      <w:r>
-        <w:rPr>
-          <w:rtl w:val="0"/>
-        </w:rPr>
+        <w:t xml:space="preserve">.</w:t>
       </w:r>
     </w:p>
     <w:p>
       <w:pPr>
         <w:numPr>
           <w:ilvl w:val="0"/>
-          <w:numId w:val="1"/>
+          <w:numId w:val="3"/>
         </w:numPr>
+        <w:spacing w:after="0" w:afterAutospacing="0" w:before="0" w:beforeAutospacing="0" w:lineRule="auto"/>
         <w:ind w:left="720" w:hanging="360"/>
-        <w:rPr>
-          <w:u w:val="none"/>
-        </w:rPr>
-      </w:pPr>
-      <w:r>
-        <w:rPr>
-          <w:rtl w:val="0"/>
-        </w:rPr>
-        <w:t xml:space="preserve">Página publica (catalogo/menú): SSG (Static Site Generation)</w:t>
-      </w:r>
-    </w:p>
-    <w:p>
-      <w:pPr>
+      </w:pPr>
+      <w:r>
+        <w:rPr>
+          <w:rtl w:val="0"/>
+        </w:rPr>
+        <w:t xml:space="preserve">Comprender especialmente los conceptos de </w:t>
+      </w:r>
+      <w:r>
+        <w:rPr>
+          <w:b w:val="1"/>
+          <w:bCs w:val="1"/>
+          <w:rtl w:val="0"/>
+        </w:rPr>
+        <w:t xml:space="preserve">tenancy</w:t>
+      </w:r>
+      <w:r>
+        <w:rPr>
+          <w:rtl w:val="0"/>
+        </w:rPr>
+        <w:t xml:space="preserve"> y la determinación del </w:t>
+      </w:r>
+      <w:r>
+        <w:rPr>
+          <w:b w:val="1"/>
+          <w:bCs w:val="1"/>
+          <w:rtl w:val="0"/>
+        </w:rPr>
+        <w:t xml:space="preserve">nivel general de OSIMM</w:t>
+      </w:r>
+      <w:r>
+        <w:rPr>
+          <w:rtl w:val="0"/>
+        </w:rPr>
+        <w:t xml:space="preserve">, ya que fueron temas que me ayudaron a entender mejor cómo identificar el modelo de aislamiento de los clientes y cómo evaluar el nivel de madurez de la arquitectura, también me ayudo mucho para el XML y XSD, tema que me cuesta un poco en la parte que a veces se me olvida cerrar los XS .</w:t>
+      </w:r>
+    </w:p>
+    <w:p>
+      <w:pPr>
+        <w:numPr>
+          <w:ilvl w:val="0"/>
+          <w:numId w:val="3"/>
+        </w:numPr>
+        <w:spacing w:after="0" w:afterAutospacing="0" w:before="0" w:beforeAutospacing="0" w:lineRule="auto"/>
+        <w:ind w:left="720" w:hanging="360"/>
+      </w:pPr>
+      <w:r>
+        <w:rPr>
+          <w:rtl w:val="0"/>
+        </w:rPr>
+        <w:t xml:space="preserve">Aclarar dudas sobre los conceptos y recibir explicaciones que me permitieran comprender mejor su aplicación en mi proyecto.</w:t>
+      </w:r>
+    </w:p>
+    <w:p>
+      <w:pPr>
+        <w:numPr>
+          <w:ilvl w:val="0"/>
+          <w:numId w:val="3"/>
+        </w:numPr>
+        <w:spacing w:after="0" w:afterAutospacing="0" w:before="0" w:beforeAutospacing="0" w:lineRule="auto"/>
+        <w:ind w:left="720" w:hanging="360"/>
+      </w:pPr>
+      <w:r>
+        <w:rPr>
+          <w:rtl w:val="0"/>
+        </w:rPr>
+        <w:t xml:space="preserve">Revisar mis propias propuestas y recibir retroalimentación para identificar posibles errores o inconsistencias.</w:t>
+      </w:r>
+    </w:p>
+    <w:p>
+      <w:pPr>
+        <w:numPr>
+          <w:ilvl w:val="0"/>
+          <w:numId w:val="3"/>
+        </w:numPr>
+        <w:spacing w:after="240" w:before="0" w:beforeAutospacing="0" w:lineRule="auto"/>
+        <w:ind w:left="720" w:hanging="360"/>
+      </w:pPr>
+      <w:r>
+        <w:rPr>
+          <w:rtl w:val="0"/>
+        </w:rPr>
+        <w:t xml:space="preserve">Comprender el funcionamiento de algunas herramientas técnicas utilizadas durante el desarrollo de la actividad, como draw.io, Lucidchart y Git/GitHub.</w:t>
+      </w:r>
+    </w:p>
+    <w:p>
+      <w:pPr>
+        <w:spacing w:after="240" w:before="240" w:lineRule="auto"/>
         <w:ind w:left="0" w:firstLine="0"/>
         <w:rPr/>
       </w:pPr>
@@ -3857,110 +4397,180 @@
         <w:rPr>
           <w:rtl w:val="0"/>
         </w:rPr>
-      </w:r>
-    </w:p>
-    <w:p>
-      <w:pPr>
-        <w:ind w:left="0" w:firstLine="0"/>
-        <w:rPr/>
-      </w:pPr>
-      <w:r>
-        <w:rPr>
-          <w:rtl w:val="0"/>
-        </w:rPr>
-        <w:t xml:space="preserve">-LPC: Muy bajo, ya que el HTML se genera una sola vez en el build y se sirve estatico, sin procesamiento en el servidor al momento de la visita.</w:t>
-      </w:r>
-    </w:p>
-    <w:p>
-      <w:pPr>
-        <w:ind w:left="0" w:firstLine="0"/>
-        <w:rPr/>
-      </w:pPr>
-      <w:r>
-        <w:rPr>
-          <w:rtl w:val="0"/>
-        </w:rPr>
-      </w:r>
-    </w:p>
-    <w:p>
-      <w:pPr>
-        <w:ind w:left="0" w:firstLine="0"/>
-        <w:rPr/>
-      </w:pPr>
-      <w:r>
-        <w:rPr>
-          <w:rtl w:val="0"/>
-        </w:rPr>
-        <w:t xml:space="preserve">-SEO: Óptimo, ya que el contenido completo está presente en el HTML desde la primera carga, facilitando su indexación por buscadores.</w:t>
-      </w:r>
-    </w:p>
-    <w:p>
-      <w:pPr>
-        <w:ind w:left="0" w:firstLine="0"/>
-        <w:rPr/>
-      </w:pPr>
-      <w:r>
-        <w:rPr>
-          <w:rtl w:val="0"/>
-        </w:rPr>
-      </w:r>
-    </w:p>
-    <w:p>
-      <w:pPr>
-        <w:ind w:left="0" w:firstLine="0"/>
-        <w:rPr/>
-      </w:pPr>
-      <w:r>
-        <w:rPr>
-          <w:rtl w:val="0"/>
-        </w:rPr>
-        <w:t xml:space="preserve">Dashboard privado: SSR (Server-Side Rendering)</w:t>
-      </w:r>
-    </w:p>
-    <w:p>
-      <w:pPr>
-        <w:ind w:left="0" w:firstLine="0"/>
-        <w:rPr/>
-      </w:pPr>
-      <w:r>
-        <w:rPr>
-          <w:rtl w:val="0"/>
-        </w:rPr>
-      </w:r>
-    </w:p>
-    <w:p>
-      <w:pPr>
-        <w:ind w:left="0" w:firstLine="0"/>
-        <w:rPr/>
-      </w:pPr>
-      <w:r>
-        <w:rPr>
-          <w:rtl w:val="0"/>
-        </w:rPr>
-        <w:t xml:space="preserve">-LPC: Moderado, mas lento que SSG porque el servidor procesa y consulta datos en cada visita, pero más rápido que CSR porque el HTML llega ya armado con contenido visible.</w:t>
-      </w:r>
-    </w:p>
-    <w:p>
-      <w:pPr>
-        <w:ind w:left="0" w:firstLine="0"/>
-        <w:rPr/>
-      </w:pPr>
-      <w:r>
-        <w:rPr>
-          <w:rtl w:val="0"/>
-        </w:rPr>
-      </w:r>
-    </w:p>
-    <w:p>
-      <w:pPr>
-        <w:ind w:left="0" w:firstLine="0"/>
-        <w:rPr/>
-      </w:pPr>
-      <w:r>
-        <w:rPr>
-          <w:rtl w:val="0"/>
-        </w:rPr>
-        <w:t xml:space="preserve">-SEO: No relevante, ya que es una página privada protegida por login, no indexada por buscadores.</w:t>
+        <w:t xml:space="preserve">Aclaración: En las imágenes que puse de XML, XSD Y DTO, son puestas en carbon code, una herramienta que una vez nos enseñó el profesor alí, para pegar código y luego se convierte en imagen para que se vea mas linda para documentos.</w:t>
+      </w:r>
+    </w:p>
+    <w:p>
+      <w:pPr>
+        <w:rPr/>
+      </w:pPr>
+      <w:r>
+        <w:rPr>
+          <w:rtl w:val="0"/>
+        </w:rPr>
+      </w:r>
+    </w:p>
+    <w:p>
+      <w:pPr>
+        <w:rPr/>
+      </w:pPr>
+      <w:r>
+        <w:rPr>
+          <w:rtl w:val="0"/>
+        </w:rPr>
+        <w:t xml:space="preserve">Enlace del Video (tema V4- DTO)</w:t>
+      </w:r>
+    </w:p>
+    <w:p>
+      <w:pPr>
+        <w:rPr/>
+      </w:pPr>
+      <w:r>
+        <w:rPr>
+          <w:rtl w:val="0"/>
+        </w:rPr>
+      </w:r>
+    </w:p>
+    <w:p>
+      <w:pPr>
+        <w:rPr/>
+      </w:pPr>
+      <w:hyperlink r:id="rId12">
+        <w:r>
+          <w:rPr>
+            <w:color w:val="1155cc"/>
+            <w:u w:val="single"/>
+            <w:rtl w:val="0"/>
+          </w:rPr>
+          <w:t xml:space="preserve">https://drive.google.com/drive/folders/1MF9S9NTNxKqZ4GkEl0PIKscBN697QCll?usp=sharing</w:t>
+        </w:r>
+      </w:hyperlink>
+      <w:r>
+        <w:rPr>
+          <w:rtl w:val="0"/>
+        </w:rPr>
+      </w:r>
+    </w:p>
+    <w:p>
+      <w:pPr>
+        <w:rPr/>
+      </w:pPr>
+      <w:r>
+        <w:rPr>
+          <w:rtl w:val="0"/>
+        </w:rPr>
+      </w:r>
+    </w:p>
+    <w:p>
+      <w:pPr>
+        <w:rPr/>
+      </w:pPr>
+      <w:r>
+        <w:rPr>
+          <w:rtl w:val="0"/>
+        </w:rPr>
+        <w:t xml:space="preserve">Enlace de evidencia (repositorio github)</w:t>
+      </w:r>
+    </w:p>
+    <w:p>
+      <w:pPr>
+        <w:rPr/>
+      </w:pPr>
+      <w:r>
+        <w:rPr>
+          <w:rtl w:val="0"/>
+        </w:rPr>
+      </w:r>
+    </w:p>
+    <w:p>
+      <w:pPr>
+        <w:rPr/>
+      </w:pPr>
+      <w:hyperlink r:id="rId13">
+        <w:r>
+          <w:rPr>
+            <w:color w:val="1155cc"/>
+            <w:u w:val="single"/>
+            <w:rtl w:val="0"/>
+          </w:rPr>
+          <w:t xml:space="preserve">https://github.com/sayuzucha/RECU_SOA</w:t>
+        </w:r>
+      </w:hyperlink>
+      <w:r>
+        <w:rPr>
+          <w:rtl w:val="0"/>
+        </w:rPr>
+      </w:r>
+    </w:p>
+    <w:p>
+      <w:pPr>
+        <w:rPr/>
+      </w:pPr>
+      <w:r>
+        <w:rPr>
+          <w:rtl w:val="0"/>
+        </w:rPr>
+      </w:r>
+    </w:p>
+    <w:p>
+      <w:pPr>
+        <w:rPr/>
+      </w:pPr>
+      <w:r>
+        <w:rPr>
+          <w:rtl w:val="0"/>
+        </w:rPr>
+        <w:t xml:space="preserve">Diagrama editable:</w:t>
+      </w:r>
+    </w:p>
+    <w:p>
+      <w:pPr>
+        <w:rPr/>
+      </w:pPr>
+      <w:r>
+        <w:rPr>
+          <w:rtl w:val="0"/>
+        </w:rPr>
+      </w:r>
+    </w:p>
+    <w:p>
+      <w:pPr>
+        <w:rPr/>
+      </w:pPr>
+      <w:hyperlink r:id="rId14">
+        <w:r>
+          <w:rPr>
+            <w:color w:val="1155cc"/>
+            <w:u w:val="single"/>
+            <w:rtl w:val="0"/>
+          </w:rPr>
+          <w:t xml:space="preserve">https://drive.google.com/file/d/1ivFu1LclB9kzS4NKD-dPwB9UJBtAg8mg/view?usp=sharing</w:t>
+        </w:r>
+      </w:hyperlink>
+      <w:r>
+        <w:rPr>
+          <w:rtl w:val="0"/>
+        </w:rPr>
+      </w:r>
+    </w:p>
+    <w:p>
+      <w:pPr>
+        <w:rPr/>
+      </w:pPr>
+      <w:r>
+        <w:rPr>
+          <w:rtl w:val="0"/>
+        </w:rPr>
+      </w:r>
+    </w:p>
+    <w:p>
+      <w:pPr>
+        <w:rPr/>
+      </w:pPr>
+      <w:r>
+        <w:rPr>
+          <w:rtl w:val="0"/>
+        </w:rPr>
       </w:r>
     </w:p>
     <w:sectPr>
@@ -4197,6 +4807,116 @@
   <w:abstractNum w:abstractNumId="3">
     <w:lvl w:ilvl="0">
       <w:start w:val="1"/>
+      <w:numFmt w:val="bullet"/>
+      <w:lvlText w:val="●"/>
+      <w:lvlJc w:val="left"/>
+      <w:pPr>
+        <w:ind w:left="720" w:hanging="360"/>
+      </w:pPr>
+      <w:rPr>
+        <w:u w:val="none"/>
+      </w:rPr>
+    </w:lvl>
+    <w:lvl w:ilvl="1">
+      <w:start w:val="1"/>
+      <w:numFmt w:val="bullet"/>
+      <w:lvlText w:val="○"/>
+      <w:lvlJc w:val="left"/>
+      <w:pPr>
+        <w:ind w:left="1440" w:hanging="360"/>
+      </w:pPr>
+      <w:rPr>
+        <w:u w:val="none"/>
+      </w:rPr>
+    </w:lvl>
+    <w:lvl w:ilvl="2">
+      <w:start w:val="1"/>
+      <w:numFmt w:val="bullet"/>
+      <w:lvlText w:val="■"/>
+      <w:lvlJc w:val="left"/>
+      <w:pPr>
+        <w:ind w:left="2160" w:hanging="360"/>
+      </w:pPr>
+      <w:rPr>
+        <w:u w:val="none"/>
+      </w:rPr>
+    </w:lvl>
+    <w:lvl w:ilvl="3">
+      <w:start w:val="1"/>
+      <w:numFmt w:val="bullet"/>
+      <w:lvlText w:val="●"/>
+      <w:lvlJc w:val="left"/>
+      <w:pPr>
+        <w:ind w:left="2880" w:hanging="360"/>
+      </w:pPr>
+      <w:rPr>
+        <w:u w:val="none"/>
+      </w:rPr>
+    </w:lvl>
+    <w:lvl w:ilvl="4">
+      <w:start w:val="1"/>
+      <w:numFmt w:val="bullet"/>
+      <w:lvlText w:val="○"/>
+      <w:lvlJc w:val="left"/>
+      <w:pPr>
+        <w:ind w:left="3600" w:hanging="360"/>
+      </w:pPr>
+      <w:rPr>
+        <w:u w:val="none"/>
+      </w:rPr>
+    </w:lvl>
+    <w:lvl w:ilvl="5">
+      <w:start w:val="1"/>
+      <w:numFmt w:val="bullet"/>
+      <w:lvlText w:val="■"/>
+      <w:lvlJc w:val="left"/>
+      <w:pPr>
+        <w:ind w:left="4320" w:hanging="360"/>
+      </w:pPr>
+      <w:rPr>
+        <w:u w:val="none"/>
+      </w:rPr>
+    </w:lvl>
+    <w:lvl w:ilvl="6">
+      <w:start w:val="1"/>
+      <w:numFmt w:val="bullet"/>
+      <w:lvlText w:val="●"/>
+      <w:lvlJc w:val="left"/>
+      <w:pPr>
+        <w:ind w:left="5040" w:hanging="360"/>
+      </w:pPr>
+      <w:rPr>
+        <w:u w:val="none"/>
+      </w:rPr>
+    </w:lvl>
+    <w:lvl w:ilvl="7">
+      <w:start w:val="1"/>
+      <w:numFmt w:val="bullet"/>
+      <w:lvlText w:val="○"/>
+      <w:lvlJc w:val="left"/>
+      <w:pPr>
+        <w:ind w:left="5760" w:hanging="360"/>
+      </w:pPr>
+      <w:rPr>
+        <w:u w:val="none"/>
+      </w:rPr>
+    </w:lvl>
+    <w:lvl w:ilvl="8">
+      <w:start w:val="1"/>
+      <w:numFmt w:val="bullet"/>
+      <w:lvlText w:val="■"/>
+      <w:lvlJc w:val="left"/>
+      <w:pPr>
+        <w:ind w:left="6480" w:hanging="360"/>
+      </w:pPr>
+      <w:rPr>
+        <w:u w:val="none"/>
+      </w:rPr>
+    </w:lvl>
+  </w:abstractNum>
+  <w:abstractNum w:abstractNumId="4">
+    <w:lvl w:ilvl="0">
+      <w:start w:val="1"/>
       <w:numFmt w:val="lowerLetter"/>
       <w:lvlText w:val="%1)"/>
       <w:lvlJc w:val="left"/>
@@ -4312,6 +5032,9 @@
   </w:num>
   <w:num w:numId="3">
     <w:abstractNumId w:val="3"/>
+  </w:num>
+  <w:num w:numId="4">
+    <w:abstractNumId w:val="4"/>
   </w:num>
 </w:numbering>
 </file>

</xml_diff>